<commit_message>
implementacion de autenticacion segura con laravel sanctum y protec contra fuerza bruta
</commit_message>
<xml_diff>
--- a/Memoria.docx
+++ b/Memoria.docx
@@ -1793,6 +1793,259 @@
           <w:sz w:val="28"/>
           <w:szCs w:val="28"/>
         </w:rPr>
+        <w:t>1.3 Motivación</w:t>
+      </w:r>
+    </w:p>
+    <w:p>
+      <w:pPr>
+        <w:jc w:val="both"/>
+        <w:rPr>
+          <w:sz w:val="24"/>
+          <w:szCs w:val="24"/>
+        </w:rPr>
+      </w:pPr>
+      <w:r>
+        <w:rPr>
+          <w:sz w:val="24"/>
+          <w:szCs w:val="24"/>
+        </w:rPr>
+        <w:t>La motivación principal de este Trabajo de Fin de Grado nace del interés por la convergencia entre el desarrollo web moderno y la ciberseguridad defensiva. A diferencia de las aplicaciones convencionales, el desarrollo de una API para una clínica médica plantea retos técnicos que van más allá del simple almacenamiento de datos.</w:t>
+      </w:r>
+      <w:r>
+        <w:rPr>
+          <w:sz w:val="24"/>
+          <w:szCs w:val="24"/>
+        </w:rPr>
+        <w:br/>
+        <w:t>Puntos clave que impulsan el trabajo son:</w:t>
+      </w:r>
+    </w:p>
+    <w:p>
+      <w:pPr>
+        <w:pStyle w:val="Prrafodelista"/>
+        <w:numPr>
+          <w:ilvl w:val="0"/>
+          <w:numId w:val="24"/>
+        </w:numPr>
+        <w:jc w:val="both"/>
+        <w:rPr>
+          <w:sz w:val="24"/>
+          <w:szCs w:val="24"/>
+        </w:rPr>
+      </w:pPr>
+      <w:r>
+        <w:rPr>
+          <w:b/>
+          <w:bCs/>
+          <w:sz w:val="24"/>
+          <w:szCs w:val="24"/>
+        </w:rPr>
+        <w:t>Dominio de tecnologías profesionales:</w:t>
+      </w:r>
+      <w:r>
+        <w:rPr>
+          <w:sz w:val="24"/>
+          <w:szCs w:val="24"/>
+        </w:rPr>
+        <w:t xml:space="preserve"> El uso de </w:t>
+      </w:r>
+      <w:r>
+        <w:rPr>
+          <w:b/>
+          <w:bCs/>
+          <w:sz w:val="24"/>
+          <w:szCs w:val="24"/>
+        </w:rPr>
+        <w:t>Laravel</w:t>
+      </w:r>
+      <w:r>
+        <w:rPr>
+          <w:sz w:val="24"/>
+          <w:szCs w:val="24"/>
+        </w:rPr>
+        <w:t xml:space="preserve"> como </w:t>
+      </w:r>
+      <w:proofErr w:type="spellStart"/>
+      <w:r>
+        <w:rPr>
+          <w:sz w:val="24"/>
+          <w:szCs w:val="24"/>
+        </w:rPr>
+        <w:t>framework</w:t>
+      </w:r>
+      <w:proofErr w:type="spellEnd"/>
+      <w:r>
+        <w:rPr>
+          <w:sz w:val="24"/>
+          <w:szCs w:val="24"/>
+        </w:rPr>
+        <w:t xml:space="preserve"> de desarrollo permite explorar cómo las herramientas de industria pueden ser </w:t>
+      </w:r>
+      <w:proofErr w:type="spellStart"/>
+      <w:r>
+        <w:rPr>
+          <w:sz w:val="24"/>
+          <w:szCs w:val="24"/>
+        </w:rPr>
+        <w:t>securizadas</w:t>
+      </w:r>
+      <w:proofErr w:type="spellEnd"/>
+      <w:r>
+        <w:rPr>
+          <w:sz w:val="24"/>
+          <w:szCs w:val="24"/>
+        </w:rPr>
+        <w:t xml:space="preserve"> mediante la implementación de modelos de datos relacionales y controladores específicos para la gestión de salud. </w:t>
+      </w:r>
+    </w:p>
+    <w:p>
+      <w:pPr>
+        <w:pStyle w:val="Prrafodelista"/>
+        <w:numPr>
+          <w:ilvl w:val="0"/>
+          <w:numId w:val="24"/>
+        </w:numPr>
+        <w:jc w:val="both"/>
+        <w:rPr>
+          <w:sz w:val="24"/>
+          <w:szCs w:val="24"/>
+        </w:rPr>
+      </w:pPr>
+      <w:r>
+        <w:rPr>
+          <w:b/>
+          <w:bCs/>
+          <w:sz w:val="24"/>
+          <w:szCs w:val="24"/>
+        </w:rPr>
+        <w:t>Implementación de arquitecturas de confianza cero:</w:t>
+      </w:r>
+      <w:r>
+        <w:rPr>
+          <w:sz w:val="24"/>
+          <w:szCs w:val="24"/>
+        </w:rPr>
+        <w:t xml:space="preserve"> La motivación de ir un paso más allá en la autenticación tradicional, integrando </w:t>
+      </w:r>
+      <w:r>
+        <w:rPr>
+          <w:b/>
+          <w:bCs/>
+          <w:sz w:val="24"/>
+          <w:szCs w:val="24"/>
+        </w:rPr>
+        <w:t xml:space="preserve">Autenticación </w:t>
+      </w:r>
+      <w:proofErr w:type="spellStart"/>
+      <w:r>
+        <w:rPr>
+          <w:b/>
+          <w:bCs/>
+          <w:sz w:val="24"/>
+          <w:szCs w:val="24"/>
+        </w:rPr>
+        <w:t>Multifactor</w:t>
+      </w:r>
+      <w:proofErr w:type="spellEnd"/>
+      <w:r>
+        <w:rPr>
+          <w:b/>
+          <w:bCs/>
+          <w:sz w:val="24"/>
+          <w:szCs w:val="24"/>
+        </w:rPr>
+        <w:t xml:space="preserve"> (MFA)</w:t>
+      </w:r>
+      <w:r>
+        <w:rPr>
+          <w:sz w:val="24"/>
+          <w:szCs w:val="24"/>
+        </w:rPr>
+        <w:t xml:space="preserve"> y sistemas de auditoría (</w:t>
+      </w:r>
+      <w:proofErr w:type="spellStart"/>
+      <w:r>
+        <w:rPr>
+          <w:sz w:val="24"/>
+          <w:szCs w:val="24"/>
+        </w:rPr>
+        <w:t>security_logs</w:t>
+      </w:r>
+      <w:proofErr w:type="spellEnd"/>
+      <w:r>
+        <w:rPr>
+          <w:sz w:val="24"/>
+          <w:szCs w:val="24"/>
+        </w:rPr>
+        <w:t xml:space="preserve">) que permitan reaccionar ante intentos de intrusión. </w:t>
+      </w:r>
+    </w:p>
+    <w:p>
+      <w:pPr>
+        <w:pStyle w:val="Prrafodelista"/>
+        <w:numPr>
+          <w:ilvl w:val="0"/>
+          <w:numId w:val="24"/>
+        </w:numPr>
+        <w:jc w:val="both"/>
+        <w:rPr>
+          <w:sz w:val="24"/>
+          <w:szCs w:val="24"/>
+        </w:rPr>
+      </w:pPr>
+      <w:r>
+        <w:rPr>
+          <w:b/>
+          <w:bCs/>
+          <w:sz w:val="24"/>
+          <w:szCs w:val="24"/>
+        </w:rPr>
+        <w:lastRenderedPageBreak/>
+        <w:t>Aporte al sector salud:</w:t>
+      </w:r>
+      <w:r>
+        <w:rPr>
+          <w:sz w:val="24"/>
+          <w:szCs w:val="24"/>
+        </w:rPr>
+        <w:t xml:space="preserve"> La satisfacción de proponer un modelo de gestión documental que podría servir de base para pequeñas y medianas clínicas que necesitan digitalizarse sin comprometer la integridad de sus pacientes.</w:t>
+      </w:r>
+    </w:p>
+    <w:p>
+      <w:pPr>
+        <w:jc w:val="both"/>
+        <w:rPr>
+          <w:sz w:val="24"/>
+          <w:szCs w:val="24"/>
+        </w:rPr>
+      </w:pPr>
+    </w:p>
+    <w:p>
+      <w:pPr>
+        <w:jc w:val="both"/>
+        <w:rPr>
+          <w:sz w:val="24"/>
+          <w:szCs w:val="24"/>
+        </w:rPr>
+      </w:pPr>
+    </w:p>
+    <w:p>
+      <w:pPr>
+        <w:jc w:val="both"/>
+        <w:rPr>
+          <w:b/>
+          <w:bCs/>
+          <w:sz w:val="28"/>
+          <w:szCs w:val="28"/>
+        </w:rPr>
+      </w:pPr>
+      <w:r>
+        <w:rPr>
+          <w:b/>
+          <w:bCs/>
+          <w:sz w:val="28"/>
+          <w:szCs w:val="28"/>
+        </w:rPr>
         <w:t>1.3 El problema de la autenticación débil y la necesidad de MFA</w:t>
       </w:r>
     </w:p>
@@ -2050,23 +2303,7 @@
           <w:sz w:val="24"/>
           <w:szCs w:val="24"/>
         </w:rPr>
-        <w:t xml:space="preserve"> → móvil, token físico, </w:t>
-      </w:r>
-      <w:proofErr w:type="gramStart"/>
-      <w:r>
-        <w:rPr>
-          <w:sz w:val="24"/>
-          <w:szCs w:val="24"/>
-        </w:rPr>
-        <w:t>app</w:t>
-      </w:r>
-      <w:proofErr w:type="gramEnd"/>
-      <w:r>
-        <w:rPr>
-          <w:sz w:val="24"/>
-          <w:szCs w:val="24"/>
-        </w:rPr>
-        <w:t xml:space="preserve"> de autenticación </w:t>
+        <w:t xml:space="preserve"> → móvil, token físico, app de autenticación </w:t>
       </w:r>
     </w:p>
     <w:p>
@@ -2111,7 +2348,6 @@
           <w:sz w:val="24"/>
           <w:szCs w:val="24"/>
         </w:rPr>
-        <w:lastRenderedPageBreak/>
         <w:t xml:space="preserve">En el contexto de una API REST, la MFA no se implementa directamente en cada </w:t>
       </w:r>
       <w:proofErr w:type="spellStart"/>
@@ -2173,23 +2409,7 @@
           <w:szCs w:val="24"/>
         </w:rPr>
         <w:br/>
-        <w:t>El cliente (</w:t>
-      </w:r>
-      <w:proofErr w:type="gramStart"/>
-      <w:r>
-        <w:rPr>
-          <w:sz w:val="24"/>
-          <w:szCs w:val="24"/>
-        </w:rPr>
-        <w:t>app</w:t>
-      </w:r>
-      <w:proofErr w:type="gramEnd"/>
-      <w:r>
-        <w:rPr>
-          <w:sz w:val="24"/>
-          <w:szCs w:val="24"/>
-        </w:rPr>
-        <w:t xml:space="preserve">, </w:t>
+        <w:t xml:space="preserve">El cliente (app, </w:t>
       </w:r>
       <w:proofErr w:type="spellStart"/>
       <w:r>
@@ -2407,23 +2627,7 @@
           <w:sz w:val="24"/>
           <w:szCs w:val="24"/>
         </w:rPr>
-        <w:t xml:space="preserve">) enviado por SMS o </w:t>
-      </w:r>
-      <w:proofErr w:type="gramStart"/>
-      <w:r>
-        <w:rPr>
-          <w:sz w:val="24"/>
-          <w:szCs w:val="24"/>
-        </w:rPr>
-        <w:t>app</w:t>
-      </w:r>
-      <w:proofErr w:type="gramEnd"/>
-      <w:r>
-        <w:rPr>
-          <w:sz w:val="24"/>
-          <w:szCs w:val="24"/>
-        </w:rPr>
-        <w:t xml:space="preserve"> (como Google </w:t>
+        <w:t xml:space="preserve">) enviado por SMS o app (como Google </w:t>
       </w:r>
       <w:proofErr w:type="spellStart"/>
       <w:r>
@@ -2516,6 +2720,7 @@
           <w:sz w:val="24"/>
           <w:szCs w:val="24"/>
         </w:rPr>
+        <w:lastRenderedPageBreak/>
         <w:t>Emisión de token de acceso</w:t>
       </w:r>
       <w:r>
@@ -3002,6 +3207,7 @@
           <w:sz w:val="24"/>
           <w:szCs w:val="24"/>
         </w:rPr>
+        <w:lastRenderedPageBreak/>
         <w:t>GET</w:t>
       </w:r>
       <w:r>
@@ -3389,15 +3595,7 @@
           <w:sz w:val="24"/>
           <w:szCs w:val="24"/>
         </w:rPr>
-        <w:t xml:space="preserve"> Laravel proporciona un entorno completo para el desarrollo de aplicaciones web modernas, destacando por su facilidad de uso, estructura organizada y amplia gama de herramientas integradas. Su enfoque en la seguridad lo convierte en una opción </w:t>
-      </w:r>
-      <w:r>
-        <w:rPr>
-          <w:sz w:val="24"/>
-          <w:szCs w:val="24"/>
-        </w:rPr>
-        <w:lastRenderedPageBreak/>
-        <w:t xml:space="preserve">adecuada para proyectos que requieren protección frente a amenazas comunes, especialmente en el desarrollo de </w:t>
+        <w:t xml:space="preserve"> Laravel proporciona un entorno completo para el desarrollo de aplicaciones web modernas, destacando por su facilidad de uso, estructura organizada y amplia gama de herramientas integradas. Su enfoque en la seguridad lo convierte en una opción adecuada para proyectos que requieren protección frente a amenazas comunes, especialmente en el desarrollo de </w:t>
       </w:r>
       <w:proofErr w:type="spellStart"/>
       <w:r>
@@ -3708,17 +3906,7 @@
           <w:sz w:val="24"/>
           <w:szCs w:val="24"/>
         </w:rPr>
-        <w:t xml:space="preserve">1. </w:t>
-      </w:r>
-      <w:proofErr w:type="gramStart"/>
-      <w:r>
-        <w:rPr>
-          <w:b/>
-          <w:bCs/>
-          <w:sz w:val="24"/>
-          <w:szCs w:val="24"/>
-        </w:rPr>
-        <w:t>BOLA</w:t>
+        <w:t>1. BOLA</w:t>
       </w:r>
       <w:r>
         <w:rPr>
@@ -3732,7 +3920,6 @@
         </w:rPr>
         <w:t>(</w:t>
       </w:r>
-      <w:proofErr w:type="gramEnd"/>
       <w:r>
         <w:rPr>
           <w:sz w:val="24"/>
@@ -3791,6 +3978,7 @@
           <w:sz w:val="24"/>
           <w:szCs w:val="24"/>
         </w:rPr>
+        <w:lastRenderedPageBreak/>
         <w:drawing>
           <wp:inline distT="0" distB="0" distL="0" distR="0" wp14:anchorId="23B722F2" wp14:editId="38906498">
             <wp:extent cx="5400040" cy="952500"/>
@@ -3940,46 +4128,14 @@
           <w:sz w:val="24"/>
           <w:szCs w:val="24"/>
         </w:rPr>
-        <w:t xml:space="preserve"> </w:t>
-      </w:r>
-      <w:proofErr w:type="gramStart"/>
-      <w:r>
-        <w:rPr>
-          <w:sz w:val="24"/>
-          <w:szCs w:val="24"/>
-        </w:rPr>
-        <w:t>Además</w:t>
-      </w:r>
-      <w:proofErr w:type="gramEnd"/>
-      <w:r>
-        <w:rPr>
-          <w:sz w:val="24"/>
-          <w:szCs w:val="24"/>
-        </w:rPr>
-        <w:t xml:space="preserve"> es conveniente utilizar </w:t>
-      </w:r>
-      <w:r>
-        <w:rPr>
-          <w:sz w:val="24"/>
-          <w:szCs w:val="24"/>
-        </w:rPr>
-        <w:t xml:space="preserve">el mecanismo de autorización para comprobar si el usuario iniciado sesión tiene acceso a Realiza la acción solicitada en el registro en cada función que utiliza </w:t>
-      </w:r>
-      <w:proofErr w:type="gramStart"/>
-      <w:r>
-        <w:rPr>
-          <w:sz w:val="24"/>
-          <w:szCs w:val="24"/>
-        </w:rPr>
-        <w:t>un entrada</w:t>
-      </w:r>
-      <w:proofErr w:type="gramEnd"/>
-      <w:r>
-        <w:rPr>
-          <w:sz w:val="24"/>
-          <w:szCs w:val="24"/>
-        </w:rPr>
-        <w:t xml:space="preserve"> del cliente para acceder a un registro en la base de datos.</w:t>
+        <w:t xml:space="preserve"> Además es conveniente utilizar </w:t>
+      </w:r>
+      <w:r>
+        <w:rPr>
+          <w:sz w:val="24"/>
+          <w:szCs w:val="24"/>
+        </w:rPr>
+        <w:t>el mecanismo de autorización para comprobar si el usuario iniciado sesión tiene acceso a Realiza la acción solicitada en el registro en cada función que utiliza un entrada del cliente para acceder a un registro en la base de datos.</w:t>
       </w:r>
     </w:p>
     <w:p>
@@ -4106,7 +4262,6 @@
           <w:sz w:val="24"/>
           <w:szCs w:val="24"/>
         </w:rPr>
-        <w:lastRenderedPageBreak/>
         <w:t xml:space="preserve">Los atacantes podrán realizarlo si </w:t>
       </w:r>
       <w:r>
@@ -4442,6 +4597,7 @@
           <w:sz w:val="24"/>
           <w:szCs w:val="24"/>
         </w:rPr>
+        <w:lastRenderedPageBreak/>
         <w:drawing>
           <wp:inline distT="0" distB="0" distL="0" distR="0" wp14:anchorId="65EA7A7C" wp14:editId="47E20D78">
             <wp:extent cx="5400040" cy="1120775"/>
@@ -4839,15 +4995,7 @@
           <w:sz w:val="24"/>
           <w:szCs w:val="24"/>
         </w:rPr>
-        <w:t xml:space="preserve">Definir y hacer cumplir un tamaño máximo de datos en todos los parámetros entrantes y cargas </w:t>
-      </w:r>
-      <w:r>
-        <w:rPr>
-          <w:sz w:val="24"/>
-          <w:szCs w:val="24"/>
-        </w:rPr>
-        <w:lastRenderedPageBreak/>
-        <w:t xml:space="preserve">útiles, como la longitud máxima para cadenas, número máximo de elementos en </w:t>
+        <w:t xml:space="preserve">Definir y hacer cumplir un tamaño máximo de datos en todos los parámetros entrantes y cargas útiles, como la longitud máxima para cadenas, número máximo de elementos en </w:t>
       </w:r>
       <w:proofErr w:type="spellStart"/>
       <w:r>
@@ -5011,7 +5159,15 @@
           <w:sz w:val="24"/>
           <w:szCs w:val="24"/>
         </w:rPr>
-        <w:t>Estos defectos permiten a los atacantes acceder a funcionalidades no autorizadas. Las funciones administrativas son objetivos clave para este tipo de ataque y pueden provocar la divulgación de datos, la pérdida o corrupción de datos. En última instancia, puede provocar interrupciones en el servicio.</w:t>
+        <w:t xml:space="preserve">Estos defectos permiten a los atacantes acceder a funcionalidades no autorizadas. Las </w:t>
+      </w:r>
+      <w:r>
+        <w:rPr>
+          <w:sz w:val="24"/>
+          <w:szCs w:val="24"/>
+        </w:rPr>
+        <w:lastRenderedPageBreak/>
+        <w:t>funciones administrativas son objetivos clave para este tipo de ataque y pueden provocar la divulgación de datos, la pérdida o corrupción de datos. En última instancia, puede provocar interrupciones en el servicio.</w:t>
       </w:r>
       <w:r>
         <w:rPr>
@@ -5442,7 +5598,6 @@
           <w:sz w:val="24"/>
           <w:szCs w:val="24"/>
         </w:rPr>
-        <w:lastRenderedPageBreak/>
         <w:drawing>
           <wp:inline distT="0" distB="0" distL="0" distR="0" wp14:anchorId="59F82ADE" wp14:editId="744117B2">
             <wp:extent cx="5400040" cy="925195"/>
@@ -5575,6 +5730,7 @@
           <w:sz w:val="24"/>
           <w:szCs w:val="24"/>
         </w:rPr>
+        <w:lastRenderedPageBreak/>
         <w:t>-</w:t>
       </w:r>
       <w:r>
@@ -5805,123 +5961,6 @@
         <w:ind w:left="720"/>
         <w:jc w:val="both"/>
         <w:rPr>
-          <w:sz w:val="24"/>
-          <w:szCs w:val="24"/>
-        </w:rPr>
-      </w:pPr>
-    </w:p>
-    <w:p>
-      <w:pPr>
-        <w:jc w:val="both"/>
-        <w:rPr>
-          <w:sz w:val="24"/>
-          <w:szCs w:val="24"/>
-        </w:rPr>
-      </w:pPr>
-    </w:p>
-    <w:p>
-      <w:pPr>
-        <w:jc w:val="both"/>
-        <w:rPr>
-          <w:sz w:val="24"/>
-          <w:szCs w:val="24"/>
-        </w:rPr>
-      </w:pPr>
-    </w:p>
-    <w:p>
-      <w:pPr>
-        <w:jc w:val="both"/>
-        <w:rPr>
-          <w:sz w:val="24"/>
-          <w:szCs w:val="24"/>
-        </w:rPr>
-      </w:pPr>
-    </w:p>
-    <w:p>
-      <w:pPr>
-        <w:jc w:val="both"/>
-        <w:rPr>
-          <w:sz w:val="24"/>
-          <w:szCs w:val="24"/>
-        </w:rPr>
-      </w:pPr>
-    </w:p>
-    <w:p>
-      <w:pPr>
-        <w:jc w:val="both"/>
-        <w:rPr>
-          <w:sz w:val="24"/>
-          <w:szCs w:val="24"/>
-        </w:rPr>
-      </w:pPr>
-    </w:p>
-    <w:p>
-      <w:pPr>
-        <w:jc w:val="both"/>
-        <w:rPr>
-          <w:sz w:val="24"/>
-          <w:szCs w:val="24"/>
-        </w:rPr>
-      </w:pPr>
-    </w:p>
-    <w:p>
-      <w:pPr>
-        <w:jc w:val="both"/>
-        <w:rPr>
-          <w:sz w:val="24"/>
-          <w:szCs w:val="24"/>
-        </w:rPr>
-      </w:pPr>
-    </w:p>
-    <w:p>
-      <w:pPr>
-        <w:jc w:val="both"/>
-        <w:rPr>
-          <w:sz w:val="24"/>
-          <w:szCs w:val="24"/>
-        </w:rPr>
-      </w:pPr>
-    </w:p>
-    <w:p>
-      <w:pPr>
-        <w:jc w:val="both"/>
-        <w:rPr>
-          <w:sz w:val="24"/>
-          <w:szCs w:val="24"/>
-        </w:rPr>
-      </w:pPr>
-    </w:p>
-    <w:p>
-      <w:pPr>
-        <w:jc w:val="both"/>
-        <w:rPr>
-          <w:sz w:val="24"/>
-          <w:szCs w:val="24"/>
-        </w:rPr>
-      </w:pPr>
-    </w:p>
-    <w:p>
-      <w:pPr>
-        <w:jc w:val="both"/>
-        <w:rPr>
-          <w:sz w:val="24"/>
-          <w:szCs w:val="24"/>
-        </w:rPr>
-      </w:pPr>
-    </w:p>
-    <w:p>
-      <w:pPr>
-        <w:jc w:val="both"/>
-        <w:rPr>
-          <w:sz w:val="24"/>
-          <w:szCs w:val="24"/>
-        </w:rPr>
-      </w:pPr>
-    </w:p>
-    <w:p>
-      <w:pPr>
-        <w:jc w:val="both"/>
-        <w:rPr>
           <w:b/>
           <w:bCs/>
           <w:sz w:val="28"/>
@@ -5935,15 +5974,914 @@
           <w:sz w:val="28"/>
           <w:szCs w:val="28"/>
         </w:rPr>
-        <w:t xml:space="preserve">Capítulo 4. </w:t>
-      </w:r>
-      <w:r>
+        <w:t>Capítulo 3. Análisis y requisitos</w:t>
+      </w:r>
+    </w:p>
+    <w:p>
+      <w:pPr>
+        <w:ind w:left="720"/>
+        <w:jc w:val="both"/>
+        <w:rPr>
+          <w:b/>
+          <w:bCs/>
+          <w:sz w:val="24"/>
+          <w:szCs w:val="24"/>
+        </w:rPr>
+      </w:pPr>
+      <w:r>
+        <w:rPr>
+          <w:b/>
+          <w:bCs/>
+          <w:sz w:val="24"/>
+          <w:szCs w:val="24"/>
+        </w:rPr>
+        <w:t>3.1 Metodología y herramientas</w:t>
+      </w:r>
+    </w:p>
+    <w:p>
+      <w:pPr>
+        <w:ind w:left="720"/>
+        <w:jc w:val="both"/>
+        <w:rPr>
+          <w:sz w:val="24"/>
+          <w:szCs w:val="24"/>
+        </w:rPr>
+      </w:pPr>
+      <w:r>
+        <w:rPr>
+          <w:sz w:val="24"/>
+          <w:szCs w:val="24"/>
+        </w:rPr>
+        <w:t>-</w:t>
+      </w:r>
+      <w:proofErr w:type="spellStart"/>
+      <w:r>
+        <w:rPr>
+          <w:sz w:val="24"/>
+          <w:szCs w:val="24"/>
+        </w:rPr>
+        <w:t>Eloquent</w:t>
+      </w:r>
+      <w:proofErr w:type="spellEnd"/>
+      <w:r>
+        <w:rPr>
+          <w:sz w:val="24"/>
+          <w:szCs w:val="24"/>
+        </w:rPr>
+        <w:t>:</w:t>
+      </w:r>
+      <w:r>
+        <w:t xml:space="preserve"> </w:t>
+      </w:r>
+      <w:r>
+        <w:rPr>
+          <w:sz w:val="24"/>
+          <w:szCs w:val="24"/>
+        </w:rPr>
+        <w:t>el "traductor" que permite que tu código PHP hable con la base de datos MySQL sin que tú tengas que escribir una sola línea de código SQL a mano.</w:t>
+      </w:r>
+    </w:p>
+    <w:p>
+      <w:pPr>
+        <w:ind w:left="720"/>
+        <w:jc w:val="both"/>
+        <w:rPr>
+          <w:sz w:val="24"/>
+          <w:szCs w:val="24"/>
+        </w:rPr>
+      </w:pPr>
+      <w:proofErr w:type="spellStart"/>
+      <w:r>
+        <w:rPr>
+          <w:sz w:val="24"/>
+          <w:szCs w:val="24"/>
+        </w:rPr>
+        <w:t>Eloquent</w:t>
+      </w:r>
+      <w:proofErr w:type="spellEnd"/>
+      <w:r>
+        <w:rPr>
+          <w:sz w:val="24"/>
+          <w:szCs w:val="24"/>
+        </w:rPr>
+        <w:t xml:space="preserve"> es un </w:t>
+      </w:r>
+      <w:r>
+        <w:rPr>
+          <w:b/>
+          <w:bCs/>
+          <w:sz w:val="24"/>
+          <w:szCs w:val="24"/>
+        </w:rPr>
+        <w:t>ORM</w:t>
+      </w:r>
+      <w:r>
+        <w:rPr>
+          <w:sz w:val="24"/>
+          <w:szCs w:val="24"/>
+        </w:rPr>
+        <w:t xml:space="preserve"> (</w:t>
+      </w:r>
+      <w:proofErr w:type="spellStart"/>
+      <w:r>
+        <w:rPr>
+          <w:i/>
+          <w:iCs/>
+          <w:sz w:val="24"/>
+          <w:szCs w:val="24"/>
+        </w:rPr>
+        <w:t>Object-Relational</w:t>
+      </w:r>
+      <w:proofErr w:type="spellEnd"/>
+      <w:r>
+        <w:rPr>
+          <w:i/>
+          <w:iCs/>
+          <w:sz w:val="24"/>
+          <w:szCs w:val="24"/>
+        </w:rPr>
+        <w:t xml:space="preserve"> </w:t>
+      </w:r>
+      <w:proofErr w:type="spellStart"/>
+      <w:r>
+        <w:rPr>
+          <w:i/>
+          <w:iCs/>
+          <w:sz w:val="24"/>
+          <w:szCs w:val="24"/>
+        </w:rPr>
+        <w:t>Mapper</w:t>
+      </w:r>
+      <w:proofErr w:type="spellEnd"/>
+      <w:r>
+        <w:rPr>
+          <w:sz w:val="24"/>
+          <w:szCs w:val="24"/>
+        </w:rPr>
+        <w:t xml:space="preserve">). En informática, un </w:t>
+      </w:r>
+      <w:proofErr w:type="spellStart"/>
+      <w:r>
+        <w:rPr>
+          <w:sz w:val="24"/>
+          <w:szCs w:val="24"/>
+        </w:rPr>
+        <w:t>mapeador</w:t>
+      </w:r>
+      <w:proofErr w:type="spellEnd"/>
+      <w:r>
+        <w:rPr>
+          <w:sz w:val="24"/>
+          <w:szCs w:val="24"/>
+        </w:rPr>
+        <w:t xml:space="preserve"> es un sistema que hace que una tabla de una base de datos (filas y columnas) se convierta en un </w:t>
+      </w:r>
+      <w:r>
+        <w:rPr>
+          <w:b/>
+          <w:bCs/>
+          <w:sz w:val="24"/>
+          <w:szCs w:val="24"/>
+        </w:rPr>
+        <w:t>Objeto</w:t>
+      </w:r>
+      <w:r>
+        <w:rPr>
+          <w:sz w:val="24"/>
+          <w:szCs w:val="24"/>
+        </w:rPr>
+        <w:t xml:space="preserve"> de programación en PHP. </w:t>
+      </w:r>
+    </w:p>
+    <w:p>
+      <w:pPr>
+        <w:numPr>
+          <w:ilvl w:val="0"/>
+          <w:numId w:val="25"/>
+        </w:numPr>
+        <w:jc w:val="both"/>
+        <w:rPr>
+          <w:sz w:val="24"/>
+          <w:szCs w:val="24"/>
+        </w:rPr>
+      </w:pPr>
+      <w:r>
+        <w:rPr>
+          <w:b/>
+          <w:bCs/>
+          <w:sz w:val="24"/>
+          <w:szCs w:val="24"/>
+        </w:rPr>
+        <w:t xml:space="preserve">Sin </w:t>
+      </w:r>
+      <w:proofErr w:type="spellStart"/>
+      <w:r>
+        <w:rPr>
+          <w:b/>
+          <w:bCs/>
+          <w:sz w:val="24"/>
+          <w:szCs w:val="24"/>
+        </w:rPr>
+        <w:t>Eloquent</w:t>
+      </w:r>
+      <w:proofErr w:type="spellEnd"/>
+      <w:r>
+        <w:rPr>
+          <w:b/>
+          <w:bCs/>
+          <w:sz w:val="24"/>
+          <w:szCs w:val="24"/>
+        </w:rPr>
+        <w:t>:</w:t>
+      </w:r>
+      <w:r>
+        <w:rPr>
+          <w:sz w:val="24"/>
+          <w:szCs w:val="24"/>
+        </w:rPr>
+        <w:t xml:space="preserve"> Tendrías que escribir: SELECT * FROM </w:t>
+      </w:r>
+      <w:proofErr w:type="spellStart"/>
+      <w:r>
+        <w:rPr>
+          <w:sz w:val="24"/>
+          <w:szCs w:val="24"/>
+        </w:rPr>
+        <w:t>informes_medicos</w:t>
+      </w:r>
+      <w:proofErr w:type="spellEnd"/>
+      <w:r>
+        <w:rPr>
+          <w:sz w:val="24"/>
+          <w:szCs w:val="24"/>
+        </w:rPr>
+        <w:t xml:space="preserve"> WHERE id = 1;</w:t>
+      </w:r>
+    </w:p>
+    <w:p>
+      <w:pPr>
+        <w:numPr>
+          <w:ilvl w:val="0"/>
+          <w:numId w:val="25"/>
+        </w:numPr>
+        <w:jc w:val="both"/>
+        <w:rPr>
+          <w:sz w:val="24"/>
+          <w:szCs w:val="24"/>
+        </w:rPr>
+      </w:pPr>
+      <w:r>
+        <w:rPr>
+          <w:b/>
+          <w:bCs/>
+          <w:sz w:val="24"/>
+          <w:szCs w:val="24"/>
+        </w:rPr>
+        <w:t xml:space="preserve">Con </w:t>
+      </w:r>
+      <w:proofErr w:type="spellStart"/>
+      <w:r>
+        <w:rPr>
+          <w:b/>
+          <w:bCs/>
+          <w:sz w:val="24"/>
+          <w:szCs w:val="24"/>
+        </w:rPr>
+        <w:t>Eloquent</w:t>
+      </w:r>
+      <w:proofErr w:type="spellEnd"/>
+      <w:r>
+        <w:rPr>
+          <w:b/>
+          <w:bCs/>
+          <w:sz w:val="24"/>
+          <w:szCs w:val="24"/>
+        </w:rPr>
+        <w:t>:</w:t>
+      </w:r>
+      <w:r>
+        <w:rPr>
+          <w:sz w:val="24"/>
+          <w:szCs w:val="24"/>
+        </w:rPr>
+        <w:t xml:space="preserve"> Simplemente escribes: </w:t>
+      </w:r>
+      <w:proofErr w:type="spellStart"/>
+      <w:r>
+        <w:rPr>
+          <w:sz w:val="24"/>
+          <w:szCs w:val="24"/>
+        </w:rPr>
+        <w:t>InformeMedico</w:t>
+      </w:r>
+      <w:proofErr w:type="spellEnd"/>
+      <w:r>
+        <w:rPr>
+          <w:sz w:val="24"/>
+          <w:szCs w:val="24"/>
+        </w:rPr>
+        <w:t>::</w:t>
+      </w:r>
+      <w:proofErr w:type="spellStart"/>
+      <w:r>
+        <w:rPr>
+          <w:sz w:val="24"/>
+          <w:szCs w:val="24"/>
+        </w:rPr>
+        <w:t>find</w:t>
+      </w:r>
+      <w:proofErr w:type="spellEnd"/>
+      <w:r>
+        <w:rPr>
+          <w:sz w:val="24"/>
+          <w:szCs w:val="24"/>
+        </w:rPr>
+        <w:t>(1);</w:t>
+      </w:r>
+    </w:p>
+    <w:p>
+      <w:pPr>
+        <w:ind w:left="720"/>
+        <w:jc w:val="both"/>
+        <w:rPr>
+          <w:sz w:val="24"/>
+          <w:szCs w:val="24"/>
+        </w:rPr>
+      </w:pPr>
+      <w:r>
+        <w:rPr>
+          <w:sz w:val="24"/>
+          <w:szCs w:val="24"/>
+        </w:rPr>
+        <w:t xml:space="preserve">Laravel utiliza el patrón </w:t>
+      </w:r>
+      <w:r>
+        <w:rPr>
+          <w:b/>
+          <w:bCs/>
+          <w:sz w:val="24"/>
+          <w:szCs w:val="24"/>
+        </w:rPr>
+        <w:t>Modelo</w:t>
+      </w:r>
+      <w:r>
+        <w:rPr>
+          <w:sz w:val="24"/>
+          <w:szCs w:val="24"/>
+        </w:rPr>
+        <w:t>, por eso tienes una carpeta llamada app/</w:t>
+      </w:r>
+      <w:proofErr w:type="spellStart"/>
+      <w:r>
+        <w:rPr>
+          <w:sz w:val="24"/>
+          <w:szCs w:val="24"/>
+        </w:rPr>
+        <w:t>Models</w:t>
+      </w:r>
+      <w:proofErr w:type="spellEnd"/>
+      <w:r>
+        <w:rPr>
+          <w:sz w:val="24"/>
+          <w:szCs w:val="24"/>
+        </w:rPr>
+        <w:t xml:space="preserve">. Cada archivo ahí dentro es un "embajador" de una tabla: </w:t>
+      </w:r>
+    </w:p>
+    <w:p>
+      <w:pPr>
+        <w:numPr>
+          <w:ilvl w:val="0"/>
+          <w:numId w:val="26"/>
+        </w:numPr>
+        <w:jc w:val="both"/>
+        <w:rPr>
+          <w:sz w:val="24"/>
+          <w:szCs w:val="24"/>
+        </w:rPr>
+      </w:pPr>
+      <w:r>
+        <w:rPr>
+          <w:b/>
+          <w:bCs/>
+          <w:sz w:val="24"/>
+          <w:szCs w:val="24"/>
+        </w:rPr>
+        <w:t xml:space="preserve">El Modelo </w:t>
+      </w:r>
+      <w:proofErr w:type="spellStart"/>
+      <w:r>
+        <w:rPr>
+          <w:b/>
+          <w:bCs/>
+          <w:sz w:val="24"/>
+          <w:szCs w:val="24"/>
+        </w:rPr>
+        <w:t>User.php</w:t>
+      </w:r>
+      <w:proofErr w:type="spellEnd"/>
+      <w:r>
+        <w:rPr>
+          <w:sz w:val="24"/>
+          <w:szCs w:val="24"/>
+        </w:rPr>
+        <w:t xml:space="preserve"> representa a la tabla </w:t>
+      </w:r>
+      <w:proofErr w:type="spellStart"/>
+      <w:r>
+        <w:rPr>
+          <w:sz w:val="24"/>
+          <w:szCs w:val="24"/>
+        </w:rPr>
+        <w:t>users</w:t>
+      </w:r>
+      <w:proofErr w:type="spellEnd"/>
+      <w:r>
+        <w:rPr>
+          <w:sz w:val="24"/>
+          <w:szCs w:val="24"/>
+        </w:rPr>
+        <w:t xml:space="preserve">. </w:t>
+      </w:r>
+    </w:p>
+    <w:p>
+      <w:pPr>
+        <w:numPr>
+          <w:ilvl w:val="0"/>
+          <w:numId w:val="26"/>
+        </w:numPr>
+        <w:jc w:val="both"/>
+        <w:rPr>
+          <w:sz w:val="24"/>
+          <w:szCs w:val="24"/>
+        </w:rPr>
+      </w:pPr>
+      <w:r>
+        <w:rPr>
+          <w:b/>
+          <w:bCs/>
+          <w:sz w:val="24"/>
+          <w:szCs w:val="24"/>
+        </w:rPr>
+        <w:t xml:space="preserve">El Modelo </w:t>
+      </w:r>
+      <w:proofErr w:type="spellStart"/>
+      <w:r>
+        <w:rPr>
+          <w:b/>
+          <w:bCs/>
+          <w:sz w:val="24"/>
+          <w:szCs w:val="24"/>
+        </w:rPr>
+        <w:t>InformeMedico.php</w:t>
+      </w:r>
+      <w:proofErr w:type="spellEnd"/>
+      <w:r>
+        <w:rPr>
+          <w:sz w:val="24"/>
+          <w:szCs w:val="24"/>
+        </w:rPr>
+        <w:t xml:space="preserve"> representa a la tabla </w:t>
+      </w:r>
+      <w:proofErr w:type="spellStart"/>
+      <w:r>
+        <w:rPr>
+          <w:sz w:val="24"/>
+          <w:szCs w:val="24"/>
+        </w:rPr>
+        <w:t>informes_medicos</w:t>
+      </w:r>
+      <w:proofErr w:type="spellEnd"/>
+    </w:p>
+    <w:p>
+      <w:pPr>
+        <w:ind w:left="720"/>
+        <w:jc w:val="both"/>
+        <w:rPr>
+          <w:sz w:val="24"/>
+          <w:szCs w:val="24"/>
+        </w:rPr>
+      </w:pPr>
+      <w:proofErr w:type="spellStart"/>
+      <w:r>
+        <w:rPr>
+          <w:sz w:val="24"/>
+          <w:szCs w:val="24"/>
+        </w:rPr>
+        <w:t>Eloquent</w:t>
+      </w:r>
+      <w:proofErr w:type="spellEnd"/>
+      <w:r>
+        <w:rPr>
+          <w:sz w:val="24"/>
+          <w:szCs w:val="24"/>
+        </w:rPr>
+        <w:t xml:space="preserve"> hizo todo el trabajo sucio por ti: fue a MySQL, buscó el registro con ese ID, comprobó que existía y te devolvió los datos empaquetados en una variable PHP.</w:t>
+      </w:r>
+    </w:p>
+    <w:p>
+      <w:pPr>
+        <w:ind w:left="720"/>
+        <w:jc w:val="both"/>
+        <w:rPr>
+          <w:sz w:val="24"/>
+          <w:szCs w:val="24"/>
+        </w:rPr>
+      </w:pPr>
+      <w:r>
+        <w:rPr>
+          <w:sz w:val="24"/>
+          <w:szCs w:val="24"/>
+        </w:rPr>
+        <w:t>-</w:t>
+      </w:r>
+      <w:r>
+        <w:rPr>
+          <w:b/>
+          <w:bCs/>
+          <w:sz w:val="24"/>
+          <w:szCs w:val="24"/>
+        </w:rPr>
+        <w:t>Prevención de Inyección SQL:</w:t>
+      </w:r>
+      <w:r>
+        <w:rPr>
+          <w:sz w:val="24"/>
+          <w:szCs w:val="24"/>
+        </w:rPr>
+        <w:t xml:space="preserve"> </w:t>
+      </w:r>
+      <w:proofErr w:type="spellStart"/>
+      <w:r>
+        <w:rPr>
+          <w:sz w:val="24"/>
+          <w:szCs w:val="24"/>
+        </w:rPr>
+        <w:t>Eloquent</w:t>
+      </w:r>
+      <w:proofErr w:type="spellEnd"/>
+      <w:r>
+        <w:rPr>
+          <w:sz w:val="24"/>
+          <w:szCs w:val="24"/>
+        </w:rPr>
+        <w:t xml:space="preserve"> utiliza automáticamente "parámetros preparados". Esto significa que, aunque un hacker intente poner código malicioso en el ID de la URL, </w:t>
+      </w:r>
+      <w:proofErr w:type="spellStart"/>
+      <w:r>
+        <w:rPr>
+          <w:sz w:val="24"/>
+          <w:szCs w:val="24"/>
+        </w:rPr>
+        <w:t>Eloquent</w:t>
+      </w:r>
+      <w:proofErr w:type="spellEnd"/>
+      <w:r>
+        <w:rPr>
+          <w:sz w:val="24"/>
+          <w:szCs w:val="24"/>
+        </w:rPr>
+        <w:t xml:space="preserve"> lo limpia antes de enviarlo a la base de datos. </w:t>
+      </w:r>
+    </w:p>
+    <w:p>
+      <w:pPr>
+        <w:ind w:left="720"/>
+        <w:jc w:val="both"/>
+        <w:rPr>
+          <w:sz w:val="24"/>
+          <w:szCs w:val="24"/>
+        </w:rPr>
+      </w:pPr>
+      <w:r>
+        <w:rPr>
+          <w:sz w:val="24"/>
+          <w:szCs w:val="24"/>
+        </w:rPr>
+        <w:lastRenderedPageBreak/>
+        <w:t>-</w:t>
+      </w:r>
+      <w:r>
+        <w:rPr>
+          <w:b/>
+          <w:bCs/>
+          <w:sz w:val="24"/>
+          <w:szCs w:val="24"/>
+        </w:rPr>
+        <w:t>Abstracción:</w:t>
+      </w:r>
+      <w:r>
+        <w:rPr>
+          <w:sz w:val="24"/>
+          <w:szCs w:val="24"/>
+        </w:rPr>
+        <w:t xml:space="preserve"> Si mañana decides cambiar de </w:t>
+      </w:r>
+      <w:r>
+        <w:rPr>
+          <w:b/>
+          <w:bCs/>
+          <w:sz w:val="24"/>
+          <w:szCs w:val="24"/>
+        </w:rPr>
+        <w:t>MySQL</w:t>
+      </w:r>
+      <w:r>
+        <w:rPr>
+          <w:sz w:val="24"/>
+          <w:szCs w:val="24"/>
+        </w:rPr>
+        <w:t xml:space="preserve"> a </w:t>
+      </w:r>
+      <w:r>
+        <w:rPr>
+          <w:b/>
+          <w:bCs/>
+          <w:sz w:val="24"/>
+          <w:szCs w:val="24"/>
+        </w:rPr>
+        <w:t>PostgreSQL</w:t>
+      </w:r>
+      <w:r>
+        <w:rPr>
+          <w:sz w:val="24"/>
+          <w:szCs w:val="24"/>
+        </w:rPr>
+        <w:t>, no tienes que cambiar ni una línea de código de tu API. Solo cambias una línea en el archivo .</w:t>
+      </w:r>
+      <w:proofErr w:type="spellStart"/>
+      <w:r>
+        <w:rPr>
+          <w:sz w:val="24"/>
+          <w:szCs w:val="24"/>
+        </w:rPr>
+        <w:t>env</w:t>
+      </w:r>
+      <w:proofErr w:type="spellEnd"/>
+      <w:r>
+        <w:rPr>
+          <w:sz w:val="24"/>
+          <w:szCs w:val="24"/>
+        </w:rPr>
+        <w:t xml:space="preserve"> y </w:t>
+      </w:r>
+      <w:proofErr w:type="spellStart"/>
+      <w:r>
+        <w:rPr>
+          <w:sz w:val="24"/>
+          <w:szCs w:val="24"/>
+        </w:rPr>
+        <w:t>Eloquent</w:t>
+      </w:r>
+      <w:proofErr w:type="spellEnd"/>
+      <w:r>
+        <w:rPr>
+          <w:sz w:val="24"/>
+          <w:szCs w:val="24"/>
+        </w:rPr>
+        <w:t xml:space="preserve"> se encarga de traducir al nuevo idioma</w:t>
+      </w:r>
+    </w:p>
+    <w:p>
+      <w:pPr>
+        <w:ind w:left="720"/>
+        <w:jc w:val="both"/>
+        <w:rPr>
+          <w:sz w:val="24"/>
+          <w:szCs w:val="24"/>
+        </w:rPr>
+      </w:pPr>
+      <w:r>
+        <w:rPr>
+          <w:sz w:val="24"/>
+          <w:szCs w:val="24"/>
+        </w:rPr>
+        <w:t>Es un equipo de dos:</w:t>
+      </w:r>
+    </w:p>
+    <w:p>
+      <w:pPr>
+        <w:numPr>
+          <w:ilvl w:val="0"/>
+          <w:numId w:val="27"/>
+        </w:numPr>
+        <w:jc w:val="both"/>
+        <w:rPr>
+          <w:sz w:val="24"/>
+          <w:szCs w:val="24"/>
+        </w:rPr>
+      </w:pPr>
+      <w:r>
+        <w:rPr>
+          <w:b/>
+          <w:bCs/>
+          <w:sz w:val="24"/>
+          <w:szCs w:val="24"/>
+        </w:rPr>
+        <w:t>La Migración:</w:t>
+      </w:r>
+      <w:r>
+        <w:rPr>
+          <w:sz w:val="24"/>
+          <w:szCs w:val="24"/>
+        </w:rPr>
+        <w:t xml:space="preserve"> Es el plano del edificio (define las columnas: titulo, diagnostico...). Crea la estructura en MySQL. </w:t>
+      </w:r>
+    </w:p>
+    <w:p>
+      <w:pPr>
+        <w:numPr>
+          <w:ilvl w:val="0"/>
+          <w:numId w:val="27"/>
+        </w:numPr>
+        <w:jc w:val="both"/>
+        <w:rPr>
+          <w:sz w:val="24"/>
+          <w:szCs w:val="24"/>
+        </w:rPr>
+      </w:pPr>
+      <w:proofErr w:type="spellStart"/>
+      <w:r>
+        <w:rPr>
+          <w:b/>
+          <w:bCs/>
+          <w:sz w:val="24"/>
+          <w:szCs w:val="24"/>
+        </w:rPr>
+        <w:t>Eloquent</w:t>
+      </w:r>
+      <w:proofErr w:type="spellEnd"/>
+      <w:r>
+        <w:rPr>
+          <w:b/>
+          <w:bCs/>
+          <w:sz w:val="24"/>
+          <w:szCs w:val="24"/>
+        </w:rPr>
+        <w:t xml:space="preserve"> (El Modelo):</w:t>
+      </w:r>
+      <w:r>
+        <w:rPr>
+          <w:sz w:val="24"/>
+          <w:szCs w:val="24"/>
+        </w:rPr>
+        <w:t xml:space="preserve"> Es el conserje del edificio. Se encarga de meter gente (datos), sacarlos o echarlos (borrar) una vez que el edificio ya está construido. </w:t>
+      </w:r>
+    </w:p>
+    <w:p>
+      <w:pPr>
+        <w:ind w:left="720"/>
+        <w:jc w:val="both"/>
+        <w:rPr>
+          <w:sz w:val="24"/>
+          <w:szCs w:val="24"/>
+        </w:rPr>
+      </w:pPr>
+    </w:p>
+    <w:p>
+      <w:pPr>
+        <w:ind w:left="720"/>
+        <w:jc w:val="both"/>
+        <w:rPr>
+          <w:sz w:val="24"/>
+          <w:szCs w:val="24"/>
+        </w:rPr>
+      </w:pPr>
+    </w:p>
+    <w:p>
+      <w:pPr>
+        <w:jc w:val="both"/>
+        <w:rPr>
+          <w:sz w:val="24"/>
+          <w:szCs w:val="24"/>
+        </w:rPr>
+      </w:pPr>
+    </w:p>
+    <w:p>
+      <w:pPr>
+        <w:jc w:val="both"/>
+        <w:rPr>
+          <w:sz w:val="24"/>
+          <w:szCs w:val="24"/>
+        </w:rPr>
+      </w:pPr>
+    </w:p>
+    <w:p>
+      <w:pPr>
+        <w:jc w:val="both"/>
+        <w:rPr>
+          <w:sz w:val="24"/>
+          <w:szCs w:val="24"/>
+        </w:rPr>
+      </w:pPr>
+    </w:p>
+    <w:p>
+      <w:pPr>
+        <w:jc w:val="both"/>
+        <w:rPr>
+          <w:sz w:val="24"/>
+          <w:szCs w:val="24"/>
+        </w:rPr>
+      </w:pPr>
+    </w:p>
+    <w:p>
+      <w:pPr>
+        <w:jc w:val="both"/>
+        <w:rPr>
+          <w:sz w:val="24"/>
+          <w:szCs w:val="24"/>
+        </w:rPr>
+      </w:pPr>
+    </w:p>
+    <w:p>
+      <w:pPr>
+        <w:jc w:val="both"/>
+        <w:rPr>
+          <w:sz w:val="24"/>
+          <w:szCs w:val="24"/>
+        </w:rPr>
+      </w:pPr>
+    </w:p>
+    <w:p>
+      <w:pPr>
+        <w:jc w:val="both"/>
+        <w:rPr>
+          <w:sz w:val="24"/>
+          <w:szCs w:val="24"/>
+        </w:rPr>
+      </w:pPr>
+    </w:p>
+    <w:p>
+      <w:pPr>
+        <w:jc w:val="both"/>
+        <w:rPr>
+          <w:sz w:val="24"/>
+          <w:szCs w:val="24"/>
+        </w:rPr>
+      </w:pPr>
+    </w:p>
+    <w:p>
+      <w:pPr>
+        <w:jc w:val="both"/>
+        <w:rPr>
+          <w:sz w:val="24"/>
+          <w:szCs w:val="24"/>
+        </w:rPr>
+      </w:pPr>
+    </w:p>
+    <w:p>
+      <w:pPr>
+        <w:jc w:val="both"/>
+        <w:rPr>
+          <w:sz w:val="24"/>
+          <w:szCs w:val="24"/>
+        </w:rPr>
+      </w:pPr>
+    </w:p>
+    <w:p>
+      <w:pPr>
+        <w:jc w:val="both"/>
+        <w:rPr>
+          <w:sz w:val="24"/>
+          <w:szCs w:val="24"/>
+        </w:rPr>
+      </w:pPr>
+    </w:p>
+    <w:p>
+      <w:pPr>
+        <w:jc w:val="both"/>
+        <w:rPr>
+          <w:sz w:val="24"/>
+          <w:szCs w:val="24"/>
+        </w:rPr>
+      </w:pPr>
+    </w:p>
+    <w:p>
+      <w:pPr>
+        <w:jc w:val="both"/>
         <w:rPr>
           <w:b/>
           <w:bCs/>
           <w:sz w:val="28"/>
           <w:szCs w:val="28"/>
         </w:rPr>
+      </w:pPr>
+      <w:r>
+        <w:rPr>
+          <w:b/>
+          <w:bCs/>
+          <w:sz w:val="28"/>
+          <w:szCs w:val="28"/>
+        </w:rPr>
+        <w:t xml:space="preserve">Capítulo 4. </w:t>
+      </w:r>
+      <w:r>
+        <w:rPr>
+          <w:b/>
+          <w:bCs/>
+          <w:sz w:val="28"/>
+          <w:szCs w:val="28"/>
+        </w:rPr>
         <w:t>Diseño del sistema</w:t>
       </w:r>
     </w:p>
@@ -5999,9 +6937,11 @@
         <w:rPr>
           <w:b/>
           <w:bCs/>
-          <w:sz w:val="24"/>
-          <w:szCs w:val="24"/>
-        </w:rPr>
+          <w:noProof/>
+          <w:sz w:val="24"/>
+          <w:szCs w:val="24"/>
+        </w:rPr>
+        <w:lastRenderedPageBreak/>
         <w:drawing>
           <wp:inline distT="0" distB="0" distL="0" distR="0" wp14:anchorId="2AC8C65C" wp14:editId="7E25FFC6">
             <wp:extent cx="5400040" cy="2917825"/>
@@ -6342,6 +7282,7 @@
           <w:sz w:val="24"/>
           <w:szCs w:val="24"/>
         </w:rPr>
+        <w:lastRenderedPageBreak/>
         <w:t>Para garantizar un entorno de desarrollo profesional, aislado y reproducible, se han utilizado las siguientes tecnologías:</w:t>
       </w:r>
     </w:p>
@@ -6653,10 +7594,10 @@
       </w:pPr>
       <w:r>
         <w:rPr>
-          <w:sz w:val="24"/>
-          <w:szCs w:val="24"/>
-        </w:rPr>
-        <w:lastRenderedPageBreak/>
+          <w:noProof/>
+          <w:sz w:val="24"/>
+          <w:szCs w:val="24"/>
+        </w:rPr>
         <w:drawing>
           <wp:inline distT="0" distB="0" distL="0" distR="0" wp14:anchorId="7BAB5E6C" wp14:editId="0DBE39FD">
             <wp:extent cx="5400040" cy="3039110"/>
@@ -6796,6 +7737,7 @@
           <w:sz w:val="24"/>
           <w:szCs w:val="24"/>
         </w:rPr>
+        <w:lastRenderedPageBreak/>
         <w:t>Control de versiones:</w:t>
       </w:r>
       <w:r>
@@ -6974,7 +7916,6 @@
           <w:sz w:val="24"/>
           <w:szCs w:val="24"/>
         </w:rPr>
-        <w:lastRenderedPageBreak/>
         <w:drawing>
           <wp:inline distT="0" distB="0" distL="0" distR="0" wp14:anchorId="0E9029F4" wp14:editId="6FCB72F0">
             <wp:extent cx="5400040" cy="3165475"/>
@@ -7038,35 +7979,28 @@
           <w:sz w:val="28"/>
           <w:szCs w:val="28"/>
         </w:rPr>
-        <w:t>I</w:t>
-      </w:r>
-      <w:r>
+        <w:t>Implementación de la Versión Base (Vulnerable):</w:t>
+      </w:r>
+    </w:p>
+    <w:p>
+      <w:pPr>
+        <w:jc w:val="both"/>
         <w:rPr>
           <w:b/>
           <w:bCs/>
           <w:sz w:val="28"/>
           <w:szCs w:val="28"/>
         </w:rPr>
-        <w:t>mplementación de la Versión Base (Vulnerable):</w:t>
-      </w:r>
-    </w:p>
-    <w:p>
-      <w:pPr>
-        <w:jc w:val="both"/>
-        <w:rPr>
-          <w:b/>
-          <w:bCs/>
+      </w:pPr>
+      <w:r>
+        <w:rPr>
+          <w:b/>
+          <w:bCs/>
+          <w:noProof/>
           <w:sz w:val="28"/>
           <w:szCs w:val="28"/>
         </w:rPr>
-      </w:pPr>
-      <w:r>
-        <w:rPr>
-          <w:b/>
-          <w:bCs/>
-          <w:sz w:val="28"/>
-          <w:szCs w:val="28"/>
-        </w:rPr>
+        <w:lastRenderedPageBreak/>
         <w:drawing>
           <wp:inline distT="0" distB="0" distL="0" distR="0" wp14:anchorId="5406D354" wp14:editId="35BA4E33">
             <wp:extent cx="5400040" cy="2846705"/>
@@ -7118,10 +8052,10 @@
         <w:rPr>
           <w:b/>
           <w:bCs/>
+          <w:noProof/>
           <w:sz w:val="28"/>
           <w:szCs w:val="28"/>
         </w:rPr>
-        <w:lastRenderedPageBreak/>
         <w:drawing>
           <wp:inline distT="0" distB="0" distL="0" distR="0" wp14:anchorId="6E1877EB" wp14:editId="70983B1C">
             <wp:extent cx="5400040" cy="2700020"/>
@@ -7258,6 +8192,7 @@
         <w:rPr>
           <w:b/>
           <w:bCs/>
+          <w:noProof/>
           <w:sz w:val="28"/>
           <w:szCs w:val="28"/>
         </w:rPr>
@@ -7314,6 +8249,7 @@
           <w:sz w:val="24"/>
           <w:szCs w:val="24"/>
         </w:rPr>
+        <w:lastRenderedPageBreak/>
         <mc:AlternateContent>
           <mc:Choice Requires="wps">
             <w:drawing>
@@ -7397,6 +8333,7 @@
         <w:rPr>
           <w:b/>
           <w:bCs/>
+          <w:noProof/>
           <w:sz w:val="28"/>
           <w:szCs w:val="28"/>
         </w:rPr>
@@ -7450,14 +8387,7 @@
           <w:sz w:val="24"/>
           <w:szCs w:val="24"/>
         </w:rPr>
-        <w:t>N</w:t>
-      </w:r>
-      <w:r>
-        <w:rPr>
-          <w:sz w:val="24"/>
-          <w:szCs w:val="24"/>
-        </w:rPr>
-        <w:t>o existe ninguna validación que compruebe si el usuario que hace la petición es el dueño del informe o un médico autorizado.</w:t>
+        <w:t>No existe ninguna validación que compruebe si el usuario que hace la petición es el dueño del informe o un médico autorizado.</w:t>
       </w:r>
     </w:p>
     <w:p>
@@ -7486,7 +8416,6 @@
           <w:sz w:val="28"/>
           <w:szCs w:val="28"/>
         </w:rPr>
-        <w:lastRenderedPageBreak/>
         <w:t>Definición de rutas</w:t>
       </w:r>
     </w:p>
@@ -7504,6 +8433,7 @@
         <w:rPr>
           <w:b/>
           <w:bCs/>
+          <w:noProof/>
           <w:sz w:val="28"/>
           <w:szCs w:val="28"/>
         </w:rPr>
@@ -7557,29 +8487,24 @@
           <w:sz w:val="24"/>
           <w:szCs w:val="24"/>
         </w:rPr>
-        <w:t>E</w:t>
-      </w:r>
-      <w:r>
-        <w:rPr>
-          <w:sz w:val="24"/>
-          <w:szCs w:val="24"/>
-        </w:rPr>
-        <w:t>stas rutas están fuera de cualquier "middleware" de autenticación, lo que las hace accesibles públicamente por cualquier herramienta como Postman.</w:t>
-      </w:r>
-    </w:p>
-    <w:p>
-      <w:pPr>
-        <w:jc w:val="both"/>
-        <w:rPr>
-          <w:sz w:val="24"/>
-          <w:szCs w:val="24"/>
-        </w:rPr>
-      </w:pPr>
-      <w:r>
-        <w:rPr>
-          <w:sz w:val="24"/>
-          <w:szCs w:val="24"/>
-        </w:rPr>
+        <w:t>Estas rutas están fuera de cualquier "middleware" de autenticación, lo que las hace accesibles públicamente por cualquier herramienta como Postman.</w:t>
+      </w:r>
+    </w:p>
+    <w:p>
+      <w:pPr>
+        <w:jc w:val="both"/>
+        <w:rPr>
+          <w:sz w:val="24"/>
+          <w:szCs w:val="24"/>
+        </w:rPr>
+      </w:pPr>
+      <w:r>
+        <w:rPr>
+          <w:noProof/>
+          <w:sz w:val="24"/>
+          <w:szCs w:val="24"/>
+        </w:rPr>
+        <w:lastRenderedPageBreak/>
         <w:drawing>
           <wp:inline distT="0" distB="0" distL="0" distR="0" wp14:anchorId="081698C8" wp14:editId="016144D4">
             <wp:extent cx="2120900" cy="2733304"/>
@@ -7699,7 +8624,6 @@
           <w:sz w:val="36"/>
           <w:szCs w:val="36"/>
         </w:rPr>
-        <w:lastRenderedPageBreak/>
         <w:t>Capítulo</w:t>
       </w:r>
       <w:r>
@@ -7746,9 +8670,11 @@
         <w:rPr>
           <w:b/>
           <w:bCs/>
+          <w:noProof/>
           <w:sz w:val="36"/>
           <w:szCs w:val="36"/>
         </w:rPr>
+        <w:lastRenderedPageBreak/>
         <w:drawing>
           <wp:inline distT="0" distB="0" distL="0" distR="0" wp14:anchorId="278F5F92" wp14:editId="19C8C29A">
             <wp:extent cx="5400040" cy="3175000"/>
@@ -7816,6 +8742,7 @@
         <w:rPr>
           <w:b/>
           <w:bCs/>
+          <w:noProof/>
           <w:sz w:val="36"/>
           <w:szCs w:val="36"/>
         </w:rPr>
@@ -7882,6 +8809,7 @@
       </w:pPr>
       <w:r>
         <w:rPr>
+          <w:noProof/>
           <w:sz w:val="24"/>
           <w:szCs w:val="24"/>
         </w:rPr>
@@ -8409,6 +9337,155 @@
     </w:lvl>
   </w:abstractNum>
   <w:abstractNum w:abstractNumId="3" w15:restartNumberingAfterBreak="0">
+    <w:nsid w:val="0DF477BA"/>
+    <w:multiLevelType w:val="multilevel"/>
+    <w:tmpl w:val="F7EEF588"/>
+    <w:lvl w:ilvl="0">
+      <w:start w:val="1"/>
+      <w:numFmt w:val="bullet"/>
+      <w:lvlText w:val=""/>
+      <w:lvlJc w:val="left"/>
+      <w:pPr>
+        <w:tabs>
+          <w:tab w:val="num" w:pos="720"/>
+        </w:tabs>
+        <w:ind w:left="720" w:hanging="360"/>
+      </w:pPr>
+      <w:rPr>
+        <w:rFonts w:ascii="Symbol" w:hAnsi="Symbol" w:hint="default"/>
+        <w:sz w:val="20"/>
+      </w:rPr>
+    </w:lvl>
+    <w:lvl w:ilvl="1" w:tentative="1">
+      <w:start w:val="1"/>
+      <w:numFmt w:val="bullet"/>
+      <w:lvlText w:val="o"/>
+      <w:lvlJc w:val="left"/>
+      <w:pPr>
+        <w:tabs>
+          <w:tab w:val="num" w:pos="1440"/>
+        </w:tabs>
+        <w:ind w:left="1440" w:hanging="360"/>
+      </w:pPr>
+      <w:rPr>
+        <w:rFonts w:ascii="Courier New" w:hAnsi="Courier New" w:hint="default"/>
+        <w:sz w:val="20"/>
+      </w:rPr>
+    </w:lvl>
+    <w:lvl w:ilvl="2" w:tentative="1">
+      <w:start w:val="1"/>
+      <w:numFmt w:val="bullet"/>
+      <w:lvlText w:val=""/>
+      <w:lvlJc w:val="left"/>
+      <w:pPr>
+        <w:tabs>
+          <w:tab w:val="num" w:pos="2160"/>
+        </w:tabs>
+        <w:ind w:left="2160" w:hanging="360"/>
+      </w:pPr>
+      <w:rPr>
+        <w:rFonts w:ascii="Wingdings" w:hAnsi="Wingdings" w:hint="default"/>
+        <w:sz w:val="20"/>
+      </w:rPr>
+    </w:lvl>
+    <w:lvl w:ilvl="3" w:tentative="1">
+      <w:start w:val="1"/>
+      <w:numFmt w:val="bullet"/>
+      <w:lvlText w:val=""/>
+      <w:lvlJc w:val="left"/>
+      <w:pPr>
+        <w:tabs>
+          <w:tab w:val="num" w:pos="2880"/>
+        </w:tabs>
+        <w:ind w:left="2880" w:hanging="360"/>
+      </w:pPr>
+      <w:rPr>
+        <w:rFonts w:ascii="Wingdings" w:hAnsi="Wingdings" w:hint="default"/>
+        <w:sz w:val="20"/>
+      </w:rPr>
+    </w:lvl>
+    <w:lvl w:ilvl="4" w:tentative="1">
+      <w:start w:val="1"/>
+      <w:numFmt w:val="bullet"/>
+      <w:lvlText w:val=""/>
+      <w:lvlJc w:val="left"/>
+      <w:pPr>
+        <w:tabs>
+          <w:tab w:val="num" w:pos="3600"/>
+        </w:tabs>
+        <w:ind w:left="3600" w:hanging="360"/>
+      </w:pPr>
+      <w:rPr>
+        <w:rFonts w:ascii="Wingdings" w:hAnsi="Wingdings" w:hint="default"/>
+        <w:sz w:val="20"/>
+      </w:rPr>
+    </w:lvl>
+    <w:lvl w:ilvl="5" w:tentative="1">
+      <w:start w:val="1"/>
+      <w:numFmt w:val="bullet"/>
+      <w:lvlText w:val=""/>
+      <w:lvlJc w:val="left"/>
+      <w:pPr>
+        <w:tabs>
+          <w:tab w:val="num" w:pos="4320"/>
+        </w:tabs>
+        <w:ind w:left="4320" w:hanging="360"/>
+      </w:pPr>
+      <w:rPr>
+        <w:rFonts w:ascii="Wingdings" w:hAnsi="Wingdings" w:hint="default"/>
+        <w:sz w:val="20"/>
+      </w:rPr>
+    </w:lvl>
+    <w:lvl w:ilvl="6" w:tentative="1">
+      <w:start w:val="1"/>
+      <w:numFmt w:val="bullet"/>
+      <w:lvlText w:val=""/>
+      <w:lvlJc w:val="left"/>
+      <w:pPr>
+        <w:tabs>
+          <w:tab w:val="num" w:pos="5040"/>
+        </w:tabs>
+        <w:ind w:left="5040" w:hanging="360"/>
+      </w:pPr>
+      <w:rPr>
+        <w:rFonts w:ascii="Wingdings" w:hAnsi="Wingdings" w:hint="default"/>
+        <w:sz w:val="20"/>
+      </w:rPr>
+    </w:lvl>
+    <w:lvl w:ilvl="7" w:tentative="1">
+      <w:start w:val="1"/>
+      <w:numFmt w:val="bullet"/>
+      <w:lvlText w:val=""/>
+      <w:lvlJc w:val="left"/>
+      <w:pPr>
+        <w:tabs>
+          <w:tab w:val="num" w:pos="5760"/>
+        </w:tabs>
+        <w:ind w:left="5760" w:hanging="360"/>
+      </w:pPr>
+      <w:rPr>
+        <w:rFonts w:ascii="Wingdings" w:hAnsi="Wingdings" w:hint="default"/>
+        <w:sz w:val="20"/>
+      </w:rPr>
+    </w:lvl>
+    <w:lvl w:ilvl="8" w:tentative="1">
+      <w:start w:val="1"/>
+      <w:numFmt w:val="bullet"/>
+      <w:lvlText w:val=""/>
+      <w:lvlJc w:val="left"/>
+      <w:pPr>
+        <w:tabs>
+          <w:tab w:val="num" w:pos="6480"/>
+        </w:tabs>
+        <w:ind w:left="6480" w:hanging="360"/>
+      </w:pPr>
+      <w:rPr>
+        <w:rFonts w:ascii="Wingdings" w:hAnsi="Wingdings" w:hint="default"/>
+        <w:sz w:val="20"/>
+      </w:rPr>
+    </w:lvl>
+  </w:abstractNum>
+  <w:abstractNum w:abstractNumId="4" w15:restartNumberingAfterBreak="0">
     <w:nsid w:val="0E9C3BAA"/>
     <w:multiLevelType w:val="multilevel"/>
     <w:tmpl w:val="10AAAC92"/>
@@ -8529,7 +9606,7 @@
       </w:rPr>
     </w:lvl>
   </w:abstractNum>
-  <w:abstractNum w:abstractNumId="4" w15:restartNumberingAfterBreak="0">
+  <w:abstractNum w:abstractNumId="5" w15:restartNumberingAfterBreak="0">
     <w:nsid w:val="0F072BEB"/>
     <w:multiLevelType w:val="multilevel"/>
     <w:tmpl w:val="241A5E00"/>
@@ -8678,7 +9755,7 @@
       </w:rPr>
     </w:lvl>
   </w:abstractNum>
-  <w:abstractNum w:abstractNumId="5" w15:restartNumberingAfterBreak="0">
+  <w:abstractNum w:abstractNumId="6" w15:restartNumberingAfterBreak="0">
     <w:nsid w:val="13D15C81"/>
     <w:multiLevelType w:val="multilevel"/>
     <w:tmpl w:val="F976C668"/>
@@ -8827,7 +9904,120 @@
       </w:rPr>
     </w:lvl>
   </w:abstractNum>
-  <w:abstractNum w:abstractNumId="6" w15:restartNumberingAfterBreak="0">
+  <w:abstractNum w:abstractNumId="7" w15:restartNumberingAfterBreak="0">
+    <w:nsid w:val="1E485B8A"/>
+    <w:multiLevelType w:val="hybridMultilevel"/>
+    <w:tmpl w:val="CD0CF8CE"/>
+    <w:lvl w:ilvl="0" w:tplc="806C1C7A">
+      <w:start w:val="1"/>
+      <w:numFmt w:val="bullet"/>
+      <w:lvlText w:val="-"/>
+      <w:lvlJc w:val="left"/>
+      <w:pPr>
+        <w:ind w:left="720" w:hanging="360"/>
+      </w:pPr>
+      <w:rPr>
+        <w:rFonts w:ascii="Calibri" w:eastAsiaTheme="minorHAnsi" w:hAnsi="Calibri" w:cs="Calibri" w:hint="default"/>
+      </w:rPr>
+    </w:lvl>
+    <w:lvl w:ilvl="1" w:tplc="0C0A0003" w:tentative="1">
+      <w:start w:val="1"/>
+      <w:numFmt w:val="bullet"/>
+      <w:lvlText w:val="o"/>
+      <w:lvlJc w:val="left"/>
+      <w:pPr>
+        <w:ind w:left="1440" w:hanging="360"/>
+      </w:pPr>
+      <w:rPr>
+        <w:rFonts w:ascii="Courier New" w:hAnsi="Courier New" w:cs="Courier New" w:hint="default"/>
+      </w:rPr>
+    </w:lvl>
+    <w:lvl w:ilvl="2" w:tplc="0C0A0005" w:tentative="1">
+      <w:start w:val="1"/>
+      <w:numFmt w:val="bullet"/>
+      <w:lvlText w:val=""/>
+      <w:lvlJc w:val="left"/>
+      <w:pPr>
+        <w:ind w:left="2160" w:hanging="360"/>
+      </w:pPr>
+      <w:rPr>
+        <w:rFonts w:ascii="Wingdings" w:hAnsi="Wingdings" w:hint="default"/>
+      </w:rPr>
+    </w:lvl>
+    <w:lvl w:ilvl="3" w:tplc="0C0A0001" w:tentative="1">
+      <w:start w:val="1"/>
+      <w:numFmt w:val="bullet"/>
+      <w:lvlText w:val=""/>
+      <w:lvlJc w:val="left"/>
+      <w:pPr>
+        <w:ind w:left="2880" w:hanging="360"/>
+      </w:pPr>
+      <w:rPr>
+        <w:rFonts w:ascii="Symbol" w:hAnsi="Symbol" w:hint="default"/>
+      </w:rPr>
+    </w:lvl>
+    <w:lvl w:ilvl="4" w:tplc="0C0A0003" w:tentative="1">
+      <w:start w:val="1"/>
+      <w:numFmt w:val="bullet"/>
+      <w:lvlText w:val="o"/>
+      <w:lvlJc w:val="left"/>
+      <w:pPr>
+        <w:ind w:left="3600" w:hanging="360"/>
+      </w:pPr>
+      <w:rPr>
+        <w:rFonts w:ascii="Courier New" w:hAnsi="Courier New" w:cs="Courier New" w:hint="default"/>
+      </w:rPr>
+    </w:lvl>
+    <w:lvl w:ilvl="5" w:tplc="0C0A0005" w:tentative="1">
+      <w:start w:val="1"/>
+      <w:numFmt w:val="bullet"/>
+      <w:lvlText w:val=""/>
+      <w:lvlJc w:val="left"/>
+      <w:pPr>
+        <w:ind w:left="4320" w:hanging="360"/>
+      </w:pPr>
+      <w:rPr>
+        <w:rFonts w:ascii="Wingdings" w:hAnsi="Wingdings" w:hint="default"/>
+      </w:rPr>
+    </w:lvl>
+    <w:lvl w:ilvl="6" w:tplc="0C0A0001" w:tentative="1">
+      <w:start w:val="1"/>
+      <w:numFmt w:val="bullet"/>
+      <w:lvlText w:val=""/>
+      <w:lvlJc w:val="left"/>
+      <w:pPr>
+        <w:ind w:left="5040" w:hanging="360"/>
+      </w:pPr>
+      <w:rPr>
+        <w:rFonts w:ascii="Symbol" w:hAnsi="Symbol" w:hint="default"/>
+      </w:rPr>
+    </w:lvl>
+    <w:lvl w:ilvl="7" w:tplc="0C0A0003" w:tentative="1">
+      <w:start w:val="1"/>
+      <w:numFmt w:val="bullet"/>
+      <w:lvlText w:val="o"/>
+      <w:lvlJc w:val="left"/>
+      <w:pPr>
+        <w:ind w:left="5760" w:hanging="360"/>
+      </w:pPr>
+      <w:rPr>
+        <w:rFonts w:ascii="Courier New" w:hAnsi="Courier New" w:cs="Courier New" w:hint="default"/>
+      </w:rPr>
+    </w:lvl>
+    <w:lvl w:ilvl="8" w:tplc="0C0A0005" w:tentative="1">
+      <w:start w:val="1"/>
+      <w:numFmt w:val="bullet"/>
+      <w:lvlText w:val=""/>
+      <w:lvlJc w:val="left"/>
+      <w:pPr>
+        <w:ind w:left="6480" w:hanging="360"/>
+      </w:pPr>
+      <w:rPr>
+        <w:rFonts w:ascii="Wingdings" w:hAnsi="Wingdings" w:hint="default"/>
+      </w:rPr>
+    </w:lvl>
+  </w:abstractNum>
+  <w:abstractNum w:abstractNumId="8" w15:restartNumberingAfterBreak="0">
     <w:nsid w:val="1E8E7685"/>
     <w:multiLevelType w:val="multilevel"/>
     <w:tmpl w:val="2E887712"/>
@@ -8976,7 +10166,7 @@
       </w:rPr>
     </w:lvl>
   </w:abstractNum>
-  <w:abstractNum w:abstractNumId="7" w15:restartNumberingAfterBreak="0">
+  <w:abstractNum w:abstractNumId="9" w15:restartNumberingAfterBreak="0">
     <w:nsid w:val="2462799D"/>
     <w:multiLevelType w:val="multilevel"/>
     <w:tmpl w:val="9DE4A5C4"/>
@@ -9093,7 +10283,7 @@
       </w:pPr>
     </w:lvl>
   </w:abstractNum>
-  <w:abstractNum w:abstractNumId="8" w15:restartNumberingAfterBreak="0">
+  <w:abstractNum w:abstractNumId="10" w15:restartNumberingAfterBreak="0">
     <w:nsid w:val="2A5544C8"/>
     <w:multiLevelType w:val="multilevel"/>
     <w:tmpl w:val="DCCABA3A"/>
@@ -9242,7 +10432,156 @@
       </w:rPr>
     </w:lvl>
   </w:abstractNum>
-  <w:abstractNum w:abstractNumId="9" w15:restartNumberingAfterBreak="0">
+  <w:abstractNum w:abstractNumId="11" w15:restartNumberingAfterBreak="0">
+    <w:nsid w:val="2E134E51"/>
+    <w:multiLevelType w:val="multilevel"/>
+    <w:tmpl w:val="82765D06"/>
+    <w:lvl w:ilvl="0">
+      <w:start w:val="1"/>
+      <w:numFmt w:val="bullet"/>
+      <w:lvlText w:val=""/>
+      <w:lvlJc w:val="left"/>
+      <w:pPr>
+        <w:tabs>
+          <w:tab w:val="num" w:pos="720"/>
+        </w:tabs>
+        <w:ind w:left="720" w:hanging="360"/>
+      </w:pPr>
+      <w:rPr>
+        <w:rFonts w:ascii="Symbol" w:hAnsi="Symbol" w:hint="default"/>
+        <w:sz w:val="20"/>
+      </w:rPr>
+    </w:lvl>
+    <w:lvl w:ilvl="1" w:tentative="1">
+      <w:start w:val="1"/>
+      <w:numFmt w:val="bullet"/>
+      <w:lvlText w:val="o"/>
+      <w:lvlJc w:val="left"/>
+      <w:pPr>
+        <w:tabs>
+          <w:tab w:val="num" w:pos="1440"/>
+        </w:tabs>
+        <w:ind w:left="1440" w:hanging="360"/>
+      </w:pPr>
+      <w:rPr>
+        <w:rFonts w:ascii="Courier New" w:hAnsi="Courier New" w:hint="default"/>
+        <w:sz w:val="20"/>
+      </w:rPr>
+    </w:lvl>
+    <w:lvl w:ilvl="2" w:tentative="1">
+      <w:start w:val="1"/>
+      <w:numFmt w:val="bullet"/>
+      <w:lvlText w:val=""/>
+      <w:lvlJc w:val="left"/>
+      <w:pPr>
+        <w:tabs>
+          <w:tab w:val="num" w:pos="2160"/>
+        </w:tabs>
+        <w:ind w:left="2160" w:hanging="360"/>
+      </w:pPr>
+      <w:rPr>
+        <w:rFonts w:ascii="Wingdings" w:hAnsi="Wingdings" w:hint="default"/>
+        <w:sz w:val="20"/>
+      </w:rPr>
+    </w:lvl>
+    <w:lvl w:ilvl="3" w:tentative="1">
+      <w:start w:val="1"/>
+      <w:numFmt w:val="bullet"/>
+      <w:lvlText w:val=""/>
+      <w:lvlJc w:val="left"/>
+      <w:pPr>
+        <w:tabs>
+          <w:tab w:val="num" w:pos="2880"/>
+        </w:tabs>
+        <w:ind w:left="2880" w:hanging="360"/>
+      </w:pPr>
+      <w:rPr>
+        <w:rFonts w:ascii="Wingdings" w:hAnsi="Wingdings" w:hint="default"/>
+        <w:sz w:val="20"/>
+      </w:rPr>
+    </w:lvl>
+    <w:lvl w:ilvl="4" w:tentative="1">
+      <w:start w:val="1"/>
+      <w:numFmt w:val="bullet"/>
+      <w:lvlText w:val=""/>
+      <w:lvlJc w:val="left"/>
+      <w:pPr>
+        <w:tabs>
+          <w:tab w:val="num" w:pos="3600"/>
+        </w:tabs>
+        <w:ind w:left="3600" w:hanging="360"/>
+      </w:pPr>
+      <w:rPr>
+        <w:rFonts w:ascii="Wingdings" w:hAnsi="Wingdings" w:hint="default"/>
+        <w:sz w:val="20"/>
+      </w:rPr>
+    </w:lvl>
+    <w:lvl w:ilvl="5" w:tentative="1">
+      <w:start w:val="1"/>
+      <w:numFmt w:val="bullet"/>
+      <w:lvlText w:val=""/>
+      <w:lvlJc w:val="left"/>
+      <w:pPr>
+        <w:tabs>
+          <w:tab w:val="num" w:pos="4320"/>
+        </w:tabs>
+        <w:ind w:left="4320" w:hanging="360"/>
+      </w:pPr>
+      <w:rPr>
+        <w:rFonts w:ascii="Wingdings" w:hAnsi="Wingdings" w:hint="default"/>
+        <w:sz w:val="20"/>
+      </w:rPr>
+    </w:lvl>
+    <w:lvl w:ilvl="6" w:tentative="1">
+      <w:start w:val="1"/>
+      <w:numFmt w:val="bullet"/>
+      <w:lvlText w:val=""/>
+      <w:lvlJc w:val="left"/>
+      <w:pPr>
+        <w:tabs>
+          <w:tab w:val="num" w:pos="5040"/>
+        </w:tabs>
+        <w:ind w:left="5040" w:hanging="360"/>
+      </w:pPr>
+      <w:rPr>
+        <w:rFonts w:ascii="Wingdings" w:hAnsi="Wingdings" w:hint="default"/>
+        <w:sz w:val="20"/>
+      </w:rPr>
+    </w:lvl>
+    <w:lvl w:ilvl="7" w:tentative="1">
+      <w:start w:val="1"/>
+      <w:numFmt w:val="bullet"/>
+      <w:lvlText w:val=""/>
+      <w:lvlJc w:val="left"/>
+      <w:pPr>
+        <w:tabs>
+          <w:tab w:val="num" w:pos="5760"/>
+        </w:tabs>
+        <w:ind w:left="5760" w:hanging="360"/>
+      </w:pPr>
+      <w:rPr>
+        <w:rFonts w:ascii="Wingdings" w:hAnsi="Wingdings" w:hint="default"/>
+        <w:sz w:val="20"/>
+      </w:rPr>
+    </w:lvl>
+    <w:lvl w:ilvl="8" w:tentative="1">
+      <w:start w:val="1"/>
+      <w:numFmt w:val="bullet"/>
+      <w:lvlText w:val=""/>
+      <w:lvlJc w:val="left"/>
+      <w:pPr>
+        <w:tabs>
+          <w:tab w:val="num" w:pos="6480"/>
+        </w:tabs>
+        <w:ind w:left="6480" w:hanging="360"/>
+      </w:pPr>
+      <w:rPr>
+        <w:rFonts w:ascii="Wingdings" w:hAnsi="Wingdings" w:hint="default"/>
+        <w:sz w:val="20"/>
+      </w:rPr>
+    </w:lvl>
+  </w:abstractNum>
+  <w:abstractNum w:abstractNumId="12" w15:restartNumberingAfterBreak="0">
     <w:nsid w:val="3B7E008A"/>
     <w:multiLevelType w:val="multilevel"/>
     <w:tmpl w:val="A0B6DC6C"/>
@@ -9391,7 +10730,156 @@
       </w:rPr>
     </w:lvl>
   </w:abstractNum>
-  <w:abstractNum w:abstractNumId="10" w15:restartNumberingAfterBreak="0">
+  <w:abstractNum w:abstractNumId="13" w15:restartNumberingAfterBreak="0">
+    <w:nsid w:val="3C4C000F"/>
+    <w:multiLevelType w:val="multilevel"/>
+    <w:tmpl w:val="DB9EB6A0"/>
+    <w:lvl w:ilvl="0">
+      <w:start w:val="1"/>
+      <w:numFmt w:val="bullet"/>
+      <w:lvlText w:val=""/>
+      <w:lvlJc w:val="left"/>
+      <w:pPr>
+        <w:tabs>
+          <w:tab w:val="num" w:pos="720"/>
+        </w:tabs>
+        <w:ind w:left="720" w:hanging="360"/>
+      </w:pPr>
+      <w:rPr>
+        <w:rFonts w:ascii="Symbol" w:hAnsi="Symbol" w:hint="default"/>
+        <w:sz w:val="20"/>
+      </w:rPr>
+    </w:lvl>
+    <w:lvl w:ilvl="1" w:tentative="1">
+      <w:start w:val="1"/>
+      <w:numFmt w:val="bullet"/>
+      <w:lvlText w:val="o"/>
+      <w:lvlJc w:val="left"/>
+      <w:pPr>
+        <w:tabs>
+          <w:tab w:val="num" w:pos="1440"/>
+        </w:tabs>
+        <w:ind w:left="1440" w:hanging="360"/>
+      </w:pPr>
+      <w:rPr>
+        <w:rFonts w:ascii="Courier New" w:hAnsi="Courier New" w:hint="default"/>
+        <w:sz w:val="20"/>
+      </w:rPr>
+    </w:lvl>
+    <w:lvl w:ilvl="2" w:tentative="1">
+      <w:start w:val="1"/>
+      <w:numFmt w:val="bullet"/>
+      <w:lvlText w:val=""/>
+      <w:lvlJc w:val="left"/>
+      <w:pPr>
+        <w:tabs>
+          <w:tab w:val="num" w:pos="2160"/>
+        </w:tabs>
+        <w:ind w:left="2160" w:hanging="360"/>
+      </w:pPr>
+      <w:rPr>
+        <w:rFonts w:ascii="Wingdings" w:hAnsi="Wingdings" w:hint="default"/>
+        <w:sz w:val="20"/>
+      </w:rPr>
+    </w:lvl>
+    <w:lvl w:ilvl="3" w:tentative="1">
+      <w:start w:val="1"/>
+      <w:numFmt w:val="bullet"/>
+      <w:lvlText w:val=""/>
+      <w:lvlJc w:val="left"/>
+      <w:pPr>
+        <w:tabs>
+          <w:tab w:val="num" w:pos="2880"/>
+        </w:tabs>
+        <w:ind w:left="2880" w:hanging="360"/>
+      </w:pPr>
+      <w:rPr>
+        <w:rFonts w:ascii="Wingdings" w:hAnsi="Wingdings" w:hint="default"/>
+        <w:sz w:val="20"/>
+      </w:rPr>
+    </w:lvl>
+    <w:lvl w:ilvl="4" w:tentative="1">
+      <w:start w:val="1"/>
+      <w:numFmt w:val="bullet"/>
+      <w:lvlText w:val=""/>
+      <w:lvlJc w:val="left"/>
+      <w:pPr>
+        <w:tabs>
+          <w:tab w:val="num" w:pos="3600"/>
+        </w:tabs>
+        <w:ind w:left="3600" w:hanging="360"/>
+      </w:pPr>
+      <w:rPr>
+        <w:rFonts w:ascii="Wingdings" w:hAnsi="Wingdings" w:hint="default"/>
+        <w:sz w:val="20"/>
+      </w:rPr>
+    </w:lvl>
+    <w:lvl w:ilvl="5" w:tentative="1">
+      <w:start w:val="1"/>
+      <w:numFmt w:val="bullet"/>
+      <w:lvlText w:val=""/>
+      <w:lvlJc w:val="left"/>
+      <w:pPr>
+        <w:tabs>
+          <w:tab w:val="num" w:pos="4320"/>
+        </w:tabs>
+        <w:ind w:left="4320" w:hanging="360"/>
+      </w:pPr>
+      <w:rPr>
+        <w:rFonts w:ascii="Wingdings" w:hAnsi="Wingdings" w:hint="default"/>
+        <w:sz w:val="20"/>
+      </w:rPr>
+    </w:lvl>
+    <w:lvl w:ilvl="6" w:tentative="1">
+      <w:start w:val="1"/>
+      <w:numFmt w:val="bullet"/>
+      <w:lvlText w:val=""/>
+      <w:lvlJc w:val="left"/>
+      <w:pPr>
+        <w:tabs>
+          <w:tab w:val="num" w:pos="5040"/>
+        </w:tabs>
+        <w:ind w:left="5040" w:hanging="360"/>
+      </w:pPr>
+      <w:rPr>
+        <w:rFonts w:ascii="Wingdings" w:hAnsi="Wingdings" w:hint="default"/>
+        <w:sz w:val="20"/>
+      </w:rPr>
+    </w:lvl>
+    <w:lvl w:ilvl="7" w:tentative="1">
+      <w:start w:val="1"/>
+      <w:numFmt w:val="bullet"/>
+      <w:lvlText w:val=""/>
+      <w:lvlJc w:val="left"/>
+      <w:pPr>
+        <w:tabs>
+          <w:tab w:val="num" w:pos="5760"/>
+        </w:tabs>
+        <w:ind w:left="5760" w:hanging="360"/>
+      </w:pPr>
+      <w:rPr>
+        <w:rFonts w:ascii="Wingdings" w:hAnsi="Wingdings" w:hint="default"/>
+        <w:sz w:val="20"/>
+      </w:rPr>
+    </w:lvl>
+    <w:lvl w:ilvl="8" w:tentative="1">
+      <w:start w:val="1"/>
+      <w:numFmt w:val="bullet"/>
+      <w:lvlText w:val=""/>
+      <w:lvlJc w:val="left"/>
+      <w:pPr>
+        <w:tabs>
+          <w:tab w:val="num" w:pos="6480"/>
+        </w:tabs>
+        <w:ind w:left="6480" w:hanging="360"/>
+      </w:pPr>
+      <w:rPr>
+        <w:rFonts w:ascii="Wingdings" w:hAnsi="Wingdings" w:hint="default"/>
+        <w:sz w:val="20"/>
+      </w:rPr>
+    </w:lvl>
+  </w:abstractNum>
+  <w:abstractNum w:abstractNumId="14" w15:restartNumberingAfterBreak="0">
     <w:nsid w:val="4A113400"/>
     <w:multiLevelType w:val="multilevel"/>
     <w:tmpl w:val="2FA2C78E"/>
@@ -9513,7 +11001,7 @@
       </w:rPr>
     </w:lvl>
   </w:abstractNum>
-  <w:abstractNum w:abstractNumId="11" w15:restartNumberingAfterBreak="0">
+  <w:abstractNum w:abstractNumId="15" w15:restartNumberingAfterBreak="0">
     <w:nsid w:val="526A7835"/>
     <w:multiLevelType w:val="multilevel"/>
     <w:tmpl w:val="BBE4C0FE"/>
@@ -9662,7 +11150,7 @@
       </w:rPr>
     </w:lvl>
   </w:abstractNum>
-  <w:abstractNum w:abstractNumId="12" w15:restartNumberingAfterBreak="0">
+  <w:abstractNum w:abstractNumId="16" w15:restartNumberingAfterBreak="0">
     <w:nsid w:val="55A852E6"/>
     <w:multiLevelType w:val="multilevel"/>
     <w:tmpl w:val="1A604638"/>
@@ -9811,7 +11299,7 @@
       </w:rPr>
     </w:lvl>
   </w:abstractNum>
-  <w:abstractNum w:abstractNumId="13" w15:restartNumberingAfterBreak="0">
+  <w:abstractNum w:abstractNumId="17" w15:restartNumberingAfterBreak="0">
     <w:nsid w:val="58435C45"/>
     <w:multiLevelType w:val="multilevel"/>
     <w:tmpl w:val="258CF05E"/>
@@ -9960,7 +11448,7 @@
       </w:rPr>
     </w:lvl>
   </w:abstractNum>
-  <w:abstractNum w:abstractNumId="14" w15:restartNumberingAfterBreak="0">
+  <w:abstractNum w:abstractNumId="18" w15:restartNumberingAfterBreak="0">
     <w:nsid w:val="58AD3DBD"/>
     <w:multiLevelType w:val="multilevel"/>
     <w:tmpl w:val="7C1E0308"/>
@@ -10109,7 +11597,7 @@
       </w:rPr>
     </w:lvl>
   </w:abstractNum>
-  <w:abstractNum w:abstractNumId="15" w15:restartNumberingAfterBreak="0">
+  <w:abstractNum w:abstractNumId="19" w15:restartNumberingAfterBreak="0">
     <w:nsid w:val="59991282"/>
     <w:multiLevelType w:val="multilevel"/>
     <w:tmpl w:val="6FFC974E"/>
@@ -10258,7 +11746,7 @@
       </w:rPr>
     </w:lvl>
   </w:abstractNum>
-  <w:abstractNum w:abstractNumId="16" w15:restartNumberingAfterBreak="0">
+  <w:abstractNum w:abstractNumId="20" w15:restartNumberingAfterBreak="0">
     <w:nsid w:val="6346323B"/>
     <w:multiLevelType w:val="multilevel"/>
     <w:tmpl w:val="82880B54"/>
@@ -10407,7 +11895,7 @@
       </w:rPr>
     </w:lvl>
   </w:abstractNum>
-  <w:abstractNum w:abstractNumId="17" w15:restartNumberingAfterBreak="0">
+  <w:abstractNum w:abstractNumId="21" w15:restartNumberingAfterBreak="0">
     <w:nsid w:val="6589744B"/>
     <w:multiLevelType w:val="hybridMultilevel"/>
     <w:tmpl w:val="D512938E"/>
@@ -10520,7 +12008,7 @@
       </w:rPr>
     </w:lvl>
   </w:abstractNum>
-  <w:abstractNum w:abstractNumId="18" w15:restartNumberingAfterBreak="0">
+  <w:abstractNum w:abstractNumId="22" w15:restartNumberingAfterBreak="0">
     <w:nsid w:val="68A41C67"/>
     <w:multiLevelType w:val="multilevel"/>
     <w:tmpl w:val="C5A4B06C"/>
@@ -10669,7 +12157,7 @@
       </w:rPr>
     </w:lvl>
   </w:abstractNum>
-  <w:abstractNum w:abstractNumId="19" w15:restartNumberingAfterBreak="0">
+  <w:abstractNum w:abstractNumId="23" w15:restartNumberingAfterBreak="0">
     <w:nsid w:val="6A4C3C45"/>
     <w:multiLevelType w:val="multilevel"/>
     <w:tmpl w:val="D6D2F384"/>
@@ -10818,7 +12306,7 @@
       </w:rPr>
     </w:lvl>
   </w:abstractNum>
-  <w:abstractNum w:abstractNumId="20" w15:restartNumberingAfterBreak="0">
+  <w:abstractNum w:abstractNumId="24" w15:restartNumberingAfterBreak="0">
     <w:nsid w:val="7AB00C32"/>
     <w:multiLevelType w:val="multilevel"/>
     <w:tmpl w:val="0E7AD560"/>
@@ -10967,7 +12455,7 @@
       </w:rPr>
     </w:lvl>
   </w:abstractNum>
-  <w:abstractNum w:abstractNumId="21" w15:restartNumberingAfterBreak="0">
+  <w:abstractNum w:abstractNumId="25" w15:restartNumberingAfterBreak="0">
     <w:nsid w:val="7CCD1243"/>
     <w:multiLevelType w:val="multilevel"/>
     <w:tmpl w:val="8FF2DA9C"/>
@@ -11089,7 +12577,7 @@
       </w:rPr>
     </w:lvl>
   </w:abstractNum>
-  <w:abstractNum w:abstractNumId="22" w15:restartNumberingAfterBreak="0">
+  <w:abstractNum w:abstractNumId="26" w15:restartNumberingAfterBreak="0">
     <w:nsid w:val="7DDC44FA"/>
     <w:multiLevelType w:val="multilevel"/>
     <w:tmpl w:val="EF5E91FA"/>
@@ -11203,73 +12691,85 @@
     </w:lvl>
   </w:abstractNum>
   <w:num w:numId="1" w16cid:durableId="1905792033">
-    <w:abstractNumId w:val="3"/>
+    <w:abstractNumId w:val="4"/>
   </w:num>
   <w:num w:numId="2" w16cid:durableId="714695035">
     <w:abstractNumId w:val="2"/>
   </w:num>
   <w:num w:numId="3" w16cid:durableId="1846551290">
-    <w:abstractNumId w:val="16"/>
+    <w:abstractNumId w:val="20"/>
   </w:num>
   <w:num w:numId="4" w16cid:durableId="1326860417">
-    <w:abstractNumId w:val="22"/>
+    <w:abstractNumId w:val="26"/>
   </w:num>
   <w:num w:numId="5" w16cid:durableId="1550917481">
-    <w:abstractNumId w:val="7"/>
+    <w:abstractNumId w:val="9"/>
   </w:num>
   <w:num w:numId="6" w16cid:durableId="466778385">
-    <w:abstractNumId w:val="15"/>
+    <w:abstractNumId w:val="19"/>
   </w:num>
   <w:num w:numId="7" w16cid:durableId="1561404130">
-    <w:abstractNumId w:val="9"/>
+    <w:abstractNumId w:val="12"/>
   </w:num>
   <w:num w:numId="8" w16cid:durableId="1916739165">
-    <w:abstractNumId w:val="17"/>
+    <w:abstractNumId w:val="21"/>
   </w:num>
   <w:num w:numId="9" w16cid:durableId="1187674998">
-    <w:abstractNumId w:val="18"/>
+    <w:abstractNumId w:val="22"/>
   </w:num>
   <w:num w:numId="10" w16cid:durableId="1460030313">
     <w:abstractNumId w:val="1"/>
   </w:num>
   <w:num w:numId="11" w16cid:durableId="280919808">
-    <w:abstractNumId w:val="12"/>
+    <w:abstractNumId w:val="16"/>
   </w:num>
   <w:num w:numId="12" w16cid:durableId="272129389">
-    <w:abstractNumId w:val="5"/>
+    <w:abstractNumId w:val="6"/>
   </w:num>
   <w:num w:numId="13" w16cid:durableId="1118529976">
-    <w:abstractNumId w:val="6"/>
+    <w:abstractNumId w:val="8"/>
   </w:num>
   <w:num w:numId="14" w16cid:durableId="265307396">
     <w:abstractNumId w:val="0"/>
   </w:num>
   <w:num w:numId="15" w16cid:durableId="637881594">
-    <w:abstractNumId w:val="11"/>
+    <w:abstractNumId w:val="15"/>
   </w:num>
   <w:num w:numId="16" w16cid:durableId="1645817881">
-    <w:abstractNumId w:val="19"/>
+    <w:abstractNumId w:val="23"/>
   </w:num>
   <w:num w:numId="17" w16cid:durableId="1547402215">
-    <w:abstractNumId w:val="4"/>
+    <w:abstractNumId w:val="5"/>
   </w:num>
   <w:num w:numId="18" w16cid:durableId="534588426">
-    <w:abstractNumId w:val="20"/>
+    <w:abstractNumId w:val="24"/>
   </w:num>
   <w:num w:numId="19" w16cid:durableId="1106971488">
+    <w:abstractNumId w:val="18"/>
+  </w:num>
+  <w:num w:numId="20" w16cid:durableId="2124764256">
+    <w:abstractNumId w:val="17"/>
+  </w:num>
+  <w:num w:numId="21" w16cid:durableId="1656060780">
+    <w:abstractNumId w:val="10"/>
+  </w:num>
+  <w:num w:numId="22" w16cid:durableId="534582610">
     <w:abstractNumId w:val="14"/>
   </w:num>
-  <w:num w:numId="20" w16cid:durableId="2124764256">
+  <w:num w:numId="23" w16cid:durableId="475606769">
+    <w:abstractNumId w:val="25"/>
+  </w:num>
+  <w:num w:numId="24" w16cid:durableId="579212954">
+    <w:abstractNumId w:val="7"/>
+  </w:num>
+  <w:num w:numId="25" w16cid:durableId="1916935289">
+    <w:abstractNumId w:val="3"/>
+  </w:num>
+  <w:num w:numId="26" w16cid:durableId="1692534037">
     <w:abstractNumId w:val="13"/>
   </w:num>
-  <w:num w:numId="21" w16cid:durableId="1656060780">
-    <w:abstractNumId w:val="8"/>
-  </w:num>
-  <w:num w:numId="22" w16cid:durableId="534582610">
-    <w:abstractNumId w:val="10"/>
-  </w:num>
-  <w:num w:numId="23" w16cid:durableId="475606769">
-    <w:abstractNumId w:val="21"/>
+  <w:num w:numId="27" w16cid:durableId="170722293">
+    <w:abstractNumId w:val="11"/>
   </w:num>
 </w:numbering>
 </file>

</xml_diff>

<commit_message>
cifrado del secreto MFA en base de datos
</commit_message>
<xml_diff>
--- a/Memoria.docx
+++ b/Memoria.docx
@@ -1554,6 +1554,914 @@
       <w:pPr>
         <w:jc w:val="both"/>
         <w:rPr>
+          <w:b/>
+          <w:bCs/>
+          <w:sz w:val="36"/>
+          <w:szCs w:val="36"/>
+        </w:rPr>
+      </w:pPr>
+      <w:r>
+        <w:rPr>
+          <w:b/>
+          <w:bCs/>
+          <w:sz w:val="36"/>
+          <w:szCs w:val="36"/>
+        </w:rPr>
+        <w:lastRenderedPageBreak/>
+        <w:t>Capítulo 1. Introducción</w:t>
+      </w:r>
+    </w:p>
+    <w:p>
+      <w:pPr>
+        <w:jc w:val="both"/>
+        <w:rPr>
+          <w:sz w:val="24"/>
+          <w:szCs w:val="24"/>
+          <w:u w:val="single"/>
+        </w:rPr>
+      </w:pPr>
+    </w:p>
+    <w:p>
+      <w:pPr>
+        <w:jc w:val="both"/>
+        <w:rPr>
+          <w:b/>
+          <w:bCs/>
+          <w:sz w:val="24"/>
+          <w:szCs w:val="24"/>
+        </w:rPr>
+      </w:pPr>
+      <w:r>
+        <w:rPr>
+          <w:b/>
+          <w:bCs/>
+          <w:sz w:val="24"/>
+          <w:szCs w:val="24"/>
+        </w:rPr>
+        <w:t>1.1 Contexto y motivación</w:t>
+      </w:r>
+    </w:p>
+    <w:p>
+      <w:pPr>
+        <w:jc w:val="both"/>
+        <w:rPr>
+          <w:sz w:val="24"/>
+          <w:szCs w:val="24"/>
+        </w:rPr>
+      </w:pPr>
+      <w:r>
+        <w:rPr>
+          <w:sz w:val="24"/>
+          <w:szCs w:val="24"/>
+        </w:rPr>
+        <w:t xml:space="preserve">En los últimos años, las </w:t>
+      </w:r>
+      <w:proofErr w:type="spellStart"/>
+      <w:r>
+        <w:rPr>
+          <w:sz w:val="24"/>
+          <w:szCs w:val="24"/>
+        </w:rPr>
+        <w:t>APIs</w:t>
+      </w:r>
+      <w:proofErr w:type="spellEnd"/>
+      <w:r>
+        <w:rPr>
+          <w:sz w:val="24"/>
+          <w:szCs w:val="24"/>
+        </w:rPr>
+        <w:t xml:space="preserve"> REST se han convertido en el pilar sobre el que se sostiene la mayoría del software moderno. Desde aplicaciones móviles hasta plataformas empresariales, casi cualquier sistema digital depende hoy de una API para comunicar sus componentes y exponer sus funcionalidades al exterior. Sin embargo, este protagonismo también las convierte en uno de los objetivos más frecuentes de los atacantes.</w:t>
+      </w:r>
+    </w:p>
+    <w:p>
+      <w:pPr>
+        <w:jc w:val="both"/>
+        <w:rPr>
+          <w:sz w:val="24"/>
+          <w:szCs w:val="24"/>
+        </w:rPr>
+      </w:pPr>
+      <w:r>
+        <w:rPr>
+          <w:sz w:val="24"/>
+          <w:szCs w:val="24"/>
+        </w:rPr>
+        <w:t xml:space="preserve">Según el informe OWASP API Security Top 10, las vulnerabilidades en </w:t>
+      </w:r>
+      <w:proofErr w:type="spellStart"/>
+      <w:r>
+        <w:rPr>
+          <w:sz w:val="24"/>
+          <w:szCs w:val="24"/>
+        </w:rPr>
+        <w:t>APIs</w:t>
+      </w:r>
+      <w:proofErr w:type="spellEnd"/>
+      <w:r>
+        <w:rPr>
+          <w:sz w:val="24"/>
+          <w:szCs w:val="24"/>
+        </w:rPr>
+        <w:t xml:space="preserve"> son responsables de una parte significativa de las brechas de seguridad registradas a nivel mundial. Problemas como la ausencia de autenticación, el acceso indebido a recursos de otros usuarios o la falta de limitación de peticiones son más comunes de lo que cabría esperar, incluso en sistemas desarrollados por equipos con experiencia.</w:t>
+      </w:r>
+    </w:p>
+    <w:p>
+      <w:pPr>
+        <w:jc w:val="both"/>
+        <w:rPr>
+          <w:sz w:val="24"/>
+          <w:szCs w:val="24"/>
+        </w:rPr>
+      </w:pPr>
+      <w:r>
+        <w:rPr>
+          <w:sz w:val="24"/>
+          <w:szCs w:val="24"/>
+        </w:rPr>
+        <w:t>La motivación de este trabajo surge precisamente de esa realidad. Existe una brecha importante entre saber desarrollar una API funcional y saber desarrollarla de forma segura. El objetivo no es únicamente construir un sistema que funcione, sino demostrar, de manera práctica y documentada, qué diferencia hay entre una API vulnerable y una API que aplica medidas de seguridad reales.</w:t>
+      </w:r>
+    </w:p>
+    <w:p>
+      <w:pPr>
+        <w:jc w:val="both"/>
+        <w:rPr>
+          <w:b/>
+          <w:bCs/>
+          <w:sz w:val="24"/>
+          <w:szCs w:val="24"/>
+        </w:rPr>
+      </w:pPr>
+      <w:r>
+        <w:rPr>
+          <w:b/>
+          <w:bCs/>
+          <w:sz w:val="24"/>
+          <w:szCs w:val="24"/>
+        </w:rPr>
+        <w:t>1.2 Descripción del proyecto</w:t>
+      </w:r>
+    </w:p>
+    <w:p>
+      <w:pPr>
+        <w:jc w:val="both"/>
+        <w:rPr>
+          <w:sz w:val="24"/>
+          <w:szCs w:val="24"/>
+        </w:rPr>
+      </w:pPr>
+      <w:r>
+        <w:rPr>
+          <w:sz w:val="24"/>
+          <w:szCs w:val="24"/>
+        </w:rPr>
+        <w:t xml:space="preserve">Este Trabajo de Fin de Grado consiste en el diseño, desarrollo y evaluación de una API REST aplicada a una plataforma de gestión de informes médicos. El sistema permite a los usuarios registrarse, iniciar sesión, activar la autenticación </w:t>
+      </w:r>
+      <w:proofErr w:type="spellStart"/>
+      <w:r>
+        <w:rPr>
+          <w:sz w:val="24"/>
+          <w:szCs w:val="24"/>
+        </w:rPr>
+        <w:t>multifactor</w:t>
+      </w:r>
+      <w:proofErr w:type="spellEnd"/>
+      <w:r>
+        <w:rPr>
+          <w:sz w:val="24"/>
+          <w:szCs w:val="24"/>
+        </w:rPr>
+        <w:t>, acceder a recursos protegidos según su rol y consultar registros de actividad.</w:t>
+      </w:r>
+    </w:p>
+    <w:p>
+      <w:pPr>
+        <w:jc w:val="both"/>
+        <w:rPr>
+          <w:sz w:val="24"/>
+          <w:szCs w:val="24"/>
+        </w:rPr>
+      </w:pPr>
+      <w:r>
+        <w:rPr>
+          <w:sz w:val="24"/>
+          <w:szCs w:val="24"/>
+        </w:rPr>
+        <w:t xml:space="preserve">Para demostrar la importancia de cada medida de seguridad implementada, el proyecto se ha desarrollado en dos versiones paralelas: una versión vulnerable, con protecciones mínimas, y una versión segura, que incorpora autenticación con tokens, autenticación </w:t>
+      </w:r>
+      <w:proofErr w:type="spellStart"/>
+      <w:r>
+        <w:rPr>
+          <w:sz w:val="24"/>
+          <w:szCs w:val="24"/>
+        </w:rPr>
+        <w:t>multifactor</w:t>
+      </w:r>
+      <w:proofErr w:type="spellEnd"/>
+      <w:r>
+        <w:rPr>
+          <w:sz w:val="24"/>
+          <w:szCs w:val="24"/>
+        </w:rPr>
+        <w:t xml:space="preserve"> mediante TOTP, control de acceso basado en roles, limitación de peticiones y auditoría de eventos. La comparativa entre ambas versiones constituye el núcleo de la evaluación del proyecto.</w:t>
+      </w:r>
+    </w:p>
+    <w:p>
+      <w:pPr>
+        <w:jc w:val="both"/>
+        <w:rPr>
+          <w:b/>
+          <w:bCs/>
+          <w:sz w:val="24"/>
+          <w:szCs w:val="24"/>
+        </w:rPr>
+      </w:pPr>
+      <w:r>
+        <w:rPr>
+          <w:b/>
+          <w:bCs/>
+          <w:sz w:val="24"/>
+          <w:szCs w:val="24"/>
+        </w:rPr>
+        <w:t>1.3 Estructura de la memoria</w:t>
+      </w:r>
+    </w:p>
+    <w:p>
+      <w:pPr>
+        <w:jc w:val="both"/>
+        <w:rPr>
+          <w:sz w:val="24"/>
+          <w:szCs w:val="24"/>
+        </w:rPr>
+      </w:pPr>
+      <w:r>
+        <w:rPr>
+          <w:sz w:val="24"/>
+          <w:szCs w:val="24"/>
+        </w:rPr>
+        <w:t>La memoria se organiza en siete capítulos. El Capítulo 2 recoge el estado del arte, revisando los conceptos y tecnologías sobre los que se apoya el proyecto. El Capítulo 3 presenta el análisis de requisitos y el modelo de amenazas. El Capítulo 4 describe el diseño del sistema. El Capítulo 5 detalla la implementación. El Capítulo 6 recoge las pruebas de seguridad realizadas y la comparativa entre versiones. Finalmente, el Capítulo 7 presenta las conclusiones y las posibles líneas de trabajo futuro.</w:t>
+      </w:r>
+    </w:p>
+    <w:p>
+      <w:pPr>
+        <w:jc w:val="both"/>
+        <w:rPr>
+          <w:sz w:val="24"/>
+          <w:szCs w:val="24"/>
+        </w:rPr>
+      </w:pPr>
+    </w:p>
+    <w:p>
+      <w:pPr>
+        <w:jc w:val="both"/>
+        <w:rPr>
+          <w:sz w:val="24"/>
+          <w:szCs w:val="24"/>
+        </w:rPr>
+      </w:pPr>
+    </w:p>
+    <w:p>
+      <w:pPr>
+        <w:jc w:val="both"/>
+        <w:rPr>
+          <w:sz w:val="24"/>
+          <w:szCs w:val="24"/>
+        </w:rPr>
+      </w:pPr>
+    </w:p>
+    <w:p>
+      <w:pPr>
+        <w:jc w:val="both"/>
+        <w:rPr>
+          <w:sz w:val="24"/>
+          <w:szCs w:val="24"/>
+        </w:rPr>
+      </w:pPr>
+    </w:p>
+    <w:p>
+      <w:pPr>
+        <w:jc w:val="both"/>
+        <w:rPr>
+          <w:sz w:val="24"/>
+          <w:szCs w:val="24"/>
+        </w:rPr>
+      </w:pPr>
+    </w:p>
+    <w:p>
+      <w:pPr>
+        <w:jc w:val="both"/>
+        <w:rPr>
+          <w:sz w:val="24"/>
+          <w:szCs w:val="24"/>
+        </w:rPr>
+      </w:pPr>
+    </w:p>
+    <w:p>
+      <w:pPr>
+        <w:jc w:val="both"/>
+        <w:rPr>
+          <w:sz w:val="24"/>
+          <w:szCs w:val="24"/>
+        </w:rPr>
+      </w:pPr>
+    </w:p>
+    <w:p>
+      <w:pPr>
+        <w:jc w:val="both"/>
+        <w:rPr>
+          <w:sz w:val="24"/>
+          <w:szCs w:val="24"/>
+        </w:rPr>
+      </w:pPr>
+    </w:p>
+    <w:p>
+      <w:pPr>
+        <w:jc w:val="both"/>
+        <w:rPr>
+          <w:sz w:val="24"/>
+          <w:szCs w:val="24"/>
+        </w:rPr>
+      </w:pPr>
+    </w:p>
+    <w:p>
+      <w:pPr>
+        <w:jc w:val="both"/>
+        <w:rPr>
+          <w:sz w:val="24"/>
+          <w:szCs w:val="24"/>
+        </w:rPr>
+      </w:pPr>
+    </w:p>
+    <w:p>
+      <w:pPr>
+        <w:jc w:val="both"/>
+        <w:rPr>
+          <w:sz w:val="24"/>
+          <w:szCs w:val="24"/>
+        </w:rPr>
+      </w:pPr>
+    </w:p>
+    <w:p>
+      <w:pPr>
+        <w:jc w:val="both"/>
+        <w:rPr>
+          <w:sz w:val="24"/>
+          <w:szCs w:val="24"/>
+        </w:rPr>
+      </w:pPr>
+    </w:p>
+    <w:p>
+      <w:pPr>
+        <w:jc w:val="both"/>
+        <w:rPr>
+          <w:sz w:val="24"/>
+          <w:szCs w:val="24"/>
+        </w:rPr>
+      </w:pPr>
+    </w:p>
+    <w:p>
+      <w:pPr>
+        <w:jc w:val="both"/>
+        <w:rPr>
+          <w:sz w:val="24"/>
+          <w:szCs w:val="24"/>
+        </w:rPr>
+      </w:pPr>
+    </w:p>
+    <w:p>
+      <w:pPr>
+        <w:jc w:val="both"/>
+        <w:rPr>
+          <w:sz w:val="24"/>
+          <w:szCs w:val="24"/>
+        </w:rPr>
+      </w:pPr>
+    </w:p>
+    <w:p>
+      <w:pPr>
+        <w:jc w:val="both"/>
+        <w:rPr>
+          <w:sz w:val="24"/>
+          <w:szCs w:val="24"/>
+        </w:rPr>
+      </w:pPr>
+    </w:p>
+    <w:p>
+      <w:pPr>
+        <w:jc w:val="both"/>
+        <w:rPr>
+          <w:sz w:val="24"/>
+          <w:szCs w:val="24"/>
+        </w:rPr>
+      </w:pPr>
+    </w:p>
+    <w:p>
+      <w:pPr>
+        <w:jc w:val="both"/>
+        <w:rPr>
+          <w:sz w:val="24"/>
+          <w:szCs w:val="24"/>
+        </w:rPr>
+      </w:pPr>
+    </w:p>
+    <w:p>
+      <w:pPr>
+        <w:jc w:val="both"/>
+        <w:rPr>
+          <w:sz w:val="24"/>
+          <w:szCs w:val="24"/>
+        </w:rPr>
+      </w:pPr>
+    </w:p>
+    <w:p>
+      <w:pPr>
+        <w:jc w:val="both"/>
+        <w:rPr>
+          <w:sz w:val="24"/>
+          <w:szCs w:val="24"/>
+        </w:rPr>
+      </w:pPr>
+    </w:p>
+    <w:p>
+      <w:pPr>
+        <w:jc w:val="both"/>
+        <w:rPr>
+          <w:sz w:val="24"/>
+          <w:szCs w:val="24"/>
+        </w:rPr>
+      </w:pPr>
+    </w:p>
+    <w:p>
+      <w:pPr>
+        <w:jc w:val="both"/>
+        <w:rPr>
+          <w:sz w:val="24"/>
+          <w:szCs w:val="24"/>
+        </w:rPr>
+      </w:pPr>
+    </w:p>
+    <w:p>
+      <w:pPr>
+        <w:jc w:val="both"/>
+        <w:rPr>
+          <w:sz w:val="24"/>
+          <w:szCs w:val="24"/>
+        </w:rPr>
+      </w:pPr>
+    </w:p>
+    <w:p>
+      <w:pPr>
+        <w:jc w:val="both"/>
+        <w:rPr>
+          <w:sz w:val="24"/>
+          <w:szCs w:val="24"/>
+        </w:rPr>
+      </w:pPr>
+    </w:p>
+    <w:p>
+      <w:pPr>
+        <w:jc w:val="both"/>
+        <w:rPr>
+          <w:sz w:val="24"/>
+          <w:szCs w:val="24"/>
+        </w:rPr>
+      </w:pPr>
+    </w:p>
+    <w:p>
+      <w:pPr>
+        <w:jc w:val="both"/>
+        <w:rPr>
+          <w:sz w:val="24"/>
+          <w:szCs w:val="24"/>
+        </w:rPr>
+      </w:pPr>
+    </w:p>
+    <w:p>
+      <w:pPr>
+        <w:jc w:val="both"/>
+        <w:rPr>
+          <w:sz w:val="24"/>
+          <w:szCs w:val="24"/>
+        </w:rPr>
+      </w:pPr>
+    </w:p>
+    <w:p>
+      <w:pPr>
+        <w:jc w:val="both"/>
+        <w:rPr>
+          <w:sz w:val="24"/>
+          <w:szCs w:val="24"/>
+        </w:rPr>
+      </w:pPr>
+    </w:p>
+    <w:p>
+      <w:pPr>
+        <w:jc w:val="both"/>
+        <w:rPr>
+          <w:sz w:val="24"/>
+          <w:szCs w:val="24"/>
+        </w:rPr>
+      </w:pPr>
+    </w:p>
+    <w:p>
+      <w:pPr>
+        <w:jc w:val="both"/>
+        <w:rPr>
+          <w:sz w:val="24"/>
+          <w:szCs w:val="24"/>
+        </w:rPr>
+      </w:pPr>
+    </w:p>
+    <w:p>
+      <w:pPr>
+        <w:jc w:val="both"/>
+        <w:rPr>
+          <w:sz w:val="24"/>
+          <w:szCs w:val="24"/>
+        </w:rPr>
+      </w:pPr>
+    </w:p>
+    <w:p>
+      <w:pPr>
+        <w:jc w:val="both"/>
+        <w:rPr>
+          <w:sz w:val="24"/>
+          <w:szCs w:val="24"/>
+        </w:rPr>
+      </w:pPr>
+    </w:p>
+    <w:p>
+      <w:pPr>
+        <w:jc w:val="both"/>
+        <w:rPr>
+          <w:sz w:val="24"/>
+          <w:szCs w:val="24"/>
+        </w:rPr>
+      </w:pPr>
+    </w:p>
+    <w:p>
+      <w:pPr>
+        <w:jc w:val="both"/>
+        <w:rPr>
+          <w:sz w:val="24"/>
+          <w:szCs w:val="24"/>
+        </w:rPr>
+      </w:pPr>
+    </w:p>
+    <w:p>
+      <w:pPr>
+        <w:jc w:val="both"/>
+        <w:rPr>
+          <w:sz w:val="24"/>
+          <w:szCs w:val="24"/>
+        </w:rPr>
+      </w:pPr>
+    </w:p>
+    <w:p>
+      <w:pPr>
+        <w:jc w:val="both"/>
+        <w:rPr>
+          <w:sz w:val="24"/>
+          <w:szCs w:val="24"/>
+        </w:rPr>
+      </w:pPr>
+    </w:p>
+    <w:p>
+      <w:pPr>
+        <w:jc w:val="both"/>
+        <w:rPr>
+          <w:sz w:val="24"/>
+          <w:szCs w:val="24"/>
+        </w:rPr>
+      </w:pPr>
+    </w:p>
+    <w:p>
+      <w:pPr>
+        <w:jc w:val="both"/>
+        <w:rPr>
+          <w:sz w:val="24"/>
+          <w:szCs w:val="24"/>
+        </w:rPr>
+      </w:pPr>
+    </w:p>
+    <w:p>
+      <w:pPr>
+        <w:jc w:val="both"/>
+        <w:rPr>
+          <w:sz w:val="24"/>
+          <w:szCs w:val="24"/>
+        </w:rPr>
+      </w:pPr>
+    </w:p>
+    <w:p>
+      <w:pPr>
+        <w:jc w:val="both"/>
+        <w:rPr>
+          <w:sz w:val="24"/>
+          <w:szCs w:val="24"/>
+        </w:rPr>
+      </w:pPr>
+    </w:p>
+    <w:p>
+      <w:pPr>
+        <w:jc w:val="both"/>
+        <w:rPr>
+          <w:sz w:val="24"/>
+          <w:szCs w:val="24"/>
+        </w:rPr>
+      </w:pPr>
+    </w:p>
+    <w:p>
+      <w:pPr>
+        <w:jc w:val="both"/>
+        <w:rPr>
+          <w:sz w:val="24"/>
+          <w:szCs w:val="24"/>
+        </w:rPr>
+      </w:pPr>
+    </w:p>
+    <w:p>
+      <w:pPr>
+        <w:jc w:val="both"/>
+        <w:rPr>
+          <w:sz w:val="24"/>
+          <w:szCs w:val="24"/>
+        </w:rPr>
+      </w:pPr>
+    </w:p>
+    <w:p>
+      <w:pPr>
+        <w:jc w:val="both"/>
+        <w:rPr>
+          <w:sz w:val="24"/>
+          <w:szCs w:val="24"/>
+        </w:rPr>
+      </w:pPr>
+    </w:p>
+    <w:p>
+      <w:pPr>
+        <w:jc w:val="both"/>
+        <w:rPr>
+          <w:sz w:val="24"/>
+          <w:szCs w:val="24"/>
+        </w:rPr>
+      </w:pPr>
+    </w:p>
+    <w:p>
+      <w:pPr>
+        <w:jc w:val="both"/>
+        <w:rPr>
+          <w:sz w:val="24"/>
+          <w:szCs w:val="24"/>
+        </w:rPr>
+      </w:pPr>
+    </w:p>
+    <w:p>
+      <w:pPr>
+        <w:jc w:val="both"/>
+        <w:rPr>
+          <w:sz w:val="24"/>
+          <w:szCs w:val="24"/>
+        </w:rPr>
+      </w:pPr>
+    </w:p>
+    <w:p>
+      <w:pPr>
+        <w:jc w:val="both"/>
+        <w:rPr>
+          <w:sz w:val="24"/>
+          <w:szCs w:val="24"/>
+        </w:rPr>
+      </w:pPr>
+    </w:p>
+    <w:p>
+      <w:pPr>
+        <w:jc w:val="both"/>
+        <w:rPr>
+          <w:sz w:val="24"/>
+          <w:szCs w:val="24"/>
+        </w:rPr>
+      </w:pPr>
+    </w:p>
+    <w:p>
+      <w:pPr>
+        <w:jc w:val="both"/>
+        <w:rPr>
+          <w:sz w:val="24"/>
+          <w:szCs w:val="24"/>
+        </w:rPr>
+      </w:pPr>
+    </w:p>
+    <w:p>
+      <w:pPr>
+        <w:jc w:val="both"/>
+        <w:rPr>
+          <w:sz w:val="24"/>
+          <w:szCs w:val="24"/>
+        </w:rPr>
+      </w:pPr>
+    </w:p>
+    <w:p>
+      <w:pPr>
+        <w:jc w:val="both"/>
+        <w:rPr>
+          <w:sz w:val="24"/>
+          <w:szCs w:val="24"/>
+        </w:rPr>
+      </w:pPr>
+    </w:p>
+    <w:p>
+      <w:pPr>
+        <w:jc w:val="both"/>
+        <w:rPr>
+          <w:sz w:val="24"/>
+          <w:szCs w:val="24"/>
+        </w:rPr>
+      </w:pPr>
+    </w:p>
+    <w:p>
+      <w:pPr>
+        <w:jc w:val="both"/>
+        <w:rPr>
+          <w:sz w:val="24"/>
+          <w:szCs w:val="24"/>
+        </w:rPr>
+      </w:pPr>
+    </w:p>
+    <w:p>
+      <w:pPr>
+        <w:jc w:val="both"/>
+        <w:rPr>
+          <w:sz w:val="24"/>
+          <w:szCs w:val="24"/>
+        </w:rPr>
+      </w:pPr>
+    </w:p>
+    <w:p>
+      <w:pPr>
+        <w:jc w:val="both"/>
+        <w:rPr>
+          <w:sz w:val="24"/>
+          <w:szCs w:val="24"/>
+        </w:rPr>
+      </w:pPr>
+    </w:p>
+    <w:p>
+      <w:pPr>
+        <w:jc w:val="both"/>
+        <w:rPr>
+          <w:sz w:val="24"/>
+          <w:szCs w:val="24"/>
+        </w:rPr>
+      </w:pPr>
+    </w:p>
+    <w:p>
+      <w:pPr>
+        <w:jc w:val="both"/>
+        <w:rPr>
+          <w:sz w:val="24"/>
+          <w:szCs w:val="24"/>
+        </w:rPr>
+      </w:pPr>
+    </w:p>
+    <w:p>
+      <w:pPr>
+        <w:jc w:val="both"/>
+        <w:rPr>
+          <w:sz w:val="24"/>
+          <w:szCs w:val="24"/>
+        </w:rPr>
+      </w:pPr>
+    </w:p>
+    <w:p>
+      <w:pPr>
+        <w:jc w:val="both"/>
+        <w:rPr>
+          <w:sz w:val="24"/>
+          <w:szCs w:val="24"/>
+        </w:rPr>
+      </w:pPr>
+    </w:p>
+    <w:p>
+      <w:pPr>
+        <w:jc w:val="both"/>
+        <w:rPr>
+          <w:sz w:val="24"/>
+          <w:szCs w:val="24"/>
+        </w:rPr>
+      </w:pPr>
+    </w:p>
+    <w:p>
+      <w:pPr>
+        <w:jc w:val="both"/>
+        <w:rPr>
+          <w:sz w:val="24"/>
+          <w:szCs w:val="24"/>
+        </w:rPr>
+      </w:pPr>
+    </w:p>
+    <w:p>
+      <w:pPr>
+        <w:jc w:val="both"/>
+        <w:rPr>
+          <w:sz w:val="24"/>
+          <w:szCs w:val="24"/>
+        </w:rPr>
+      </w:pPr>
+    </w:p>
+    <w:p>
+      <w:pPr>
+        <w:jc w:val="both"/>
+        <w:rPr>
+          <w:sz w:val="24"/>
+          <w:szCs w:val="24"/>
+        </w:rPr>
+      </w:pPr>
+    </w:p>
+    <w:p>
+      <w:pPr>
+        <w:jc w:val="both"/>
+        <w:rPr>
+          <w:sz w:val="24"/>
+          <w:szCs w:val="24"/>
+        </w:rPr>
+      </w:pPr>
+    </w:p>
+    <w:p>
+      <w:pPr>
+        <w:jc w:val="both"/>
+        <w:rPr>
+          <w:sz w:val="24"/>
+          <w:szCs w:val="24"/>
+        </w:rPr>
+      </w:pPr>
+    </w:p>
+    <w:p>
+      <w:pPr>
+        <w:jc w:val="both"/>
+        <w:rPr>
+          <w:sz w:val="24"/>
+          <w:szCs w:val="24"/>
+        </w:rPr>
+      </w:pPr>
+    </w:p>
+    <w:p>
+      <w:pPr>
+        <w:jc w:val="both"/>
+        <w:rPr>
+          <w:sz w:val="24"/>
+          <w:szCs w:val="24"/>
+        </w:rPr>
+      </w:pPr>
+    </w:p>
+    <w:p>
+      <w:pPr>
+        <w:jc w:val="both"/>
+        <w:rPr>
+          <w:sz w:val="24"/>
+          <w:szCs w:val="24"/>
+        </w:rPr>
+      </w:pPr>
+    </w:p>
+    <w:p>
+      <w:pPr>
+        <w:jc w:val="both"/>
+        <w:rPr>
+          <w:sz w:val="24"/>
+          <w:szCs w:val="24"/>
+        </w:rPr>
+      </w:pPr>
+    </w:p>
+    <w:p>
+      <w:pPr>
+        <w:jc w:val="both"/>
+        <w:rPr>
+          <w:sz w:val="24"/>
+          <w:szCs w:val="24"/>
+        </w:rPr>
+      </w:pPr>
+    </w:p>
+    <w:p>
+      <w:pPr>
+        <w:jc w:val="both"/>
+        <w:rPr>
+          <w:sz w:val="24"/>
+          <w:szCs w:val="24"/>
+        </w:rPr>
+      </w:pPr>
+    </w:p>
+    <w:p>
+      <w:pPr>
+        <w:jc w:val="both"/>
+        <w:rPr>
+          <w:sz w:val="24"/>
+          <w:szCs w:val="24"/>
+        </w:rPr>
+      </w:pPr>
+    </w:p>
+    <w:p>
+      <w:pPr>
+        <w:jc w:val="both"/>
+        <w:rPr>
           <w:sz w:val="24"/>
           <w:szCs w:val="24"/>
         </w:rPr>
@@ -1764,7 +2672,15 @@
           <w:sz w:val="24"/>
           <w:szCs w:val="24"/>
         </w:rPr>
-        <w:t>. Este escenario es idóneo para un estudio de ciberseguridad debido a la alta sensibilidad de los datos manejados (historiales clínicos, datos personales y citas). La fuga de esta información supondría una violación grave del RGPD (Reglamento General de Protección de Datos).</w:t>
+        <w:t xml:space="preserve">. Este escenario es idóneo para un estudio de ciberseguridad debido a la alta sensibilidad de los datos manejados (historiales clínicos, datos personales y citas). La fuga </w:t>
+      </w:r>
+      <w:r>
+        <w:rPr>
+          <w:sz w:val="24"/>
+          <w:szCs w:val="24"/>
+        </w:rPr>
+        <w:lastRenderedPageBreak/>
+        <w:t>de esta información supondría una violación grave del RGPD (Reglamento General de Protección de Datos).</w:t>
       </w:r>
     </w:p>
     <w:p>
@@ -2000,7 +2916,6 @@
           <w:sz w:val="24"/>
           <w:szCs w:val="24"/>
         </w:rPr>
-        <w:lastRenderedPageBreak/>
         <w:t>Aporte al sector salud:</w:t>
       </w:r>
       <w:r>
@@ -2303,7 +3218,23 @@
           <w:sz w:val="24"/>
           <w:szCs w:val="24"/>
         </w:rPr>
-        <w:t xml:space="preserve"> → móvil, token físico, app de autenticación </w:t>
+        <w:t xml:space="preserve"> → móvil, token físico, </w:t>
+      </w:r>
+      <w:proofErr w:type="gramStart"/>
+      <w:r>
+        <w:rPr>
+          <w:sz w:val="24"/>
+          <w:szCs w:val="24"/>
+        </w:rPr>
+        <w:t>app</w:t>
+      </w:r>
+      <w:proofErr w:type="gramEnd"/>
+      <w:r>
+        <w:rPr>
+          <w:sz w:val="24"/>
+          <w:szCs w:val="24"/>
+        </w:rPr>
+        <w:t xml:space="preserve"> de autenticación </w:t>
       </w:r>
     </w:p>
     <w:p>
@@ -2348,6 +3279,7 @@
           <w:sz w:val="24"/>
           <w:szCs w:val="24"/>
         </w:rPr>
+        <w:lastRenderedPageBreak/>
         <w:t xml:space="preserve">En el contexto de una API REST, la MFA no se implementa directamente en cada </w:t>
       </w:r>
       <w:proofErr w:type="spellStart"/>
@@ -2409,7 +3341,23 @@
           <w:szCs w:val="24"/>
         </w:rPr>
         <w:br/>
-        <w:t xml:space="preserve">El cliente (app, </w:t>
+        <w:t>El cliente (</w:t>
+      </w:r>
+      <w:proofErr w:type="gramStart"/>
+      <w:r>
+        <w:rPr>
+          <w:sz w:val="24"/>
+          <w:szCs w:val="24"/>
+        </w:rPr>
+        <w:t>app</w:t>
+      </w:r>
+      <w:proofErr w:type="gramEnd"/>
+      <w:r>
+        <w:rPr>
+          <w:sz w:val="24"/>
+          <w:szCs w:val="24"/>
+        </w:rPr>
+        <w:t xml:space="preserve">, </w:t>
       </w:r>
       <w:proofErr w:type="spellStart"/>
       <w:r>
@@ -2595,7 +3543,7 @@
           <w:sz w:val="24"/>
           <w:szCs w:val="24"/>
         </w:rPr>
-        <w:t>código OTP (</w:t>
+        <w:t xml:space="preserve">código OTP (One-Time </w:t>
       </w:r>
       <w:proofErr w:type="spellStart"/>
       <w:r>
@@ -2603,7 +3551,7 @@
           <w:sz w:val="24"/>
           <w:szCs w:val="24"/>
         </w:rPr>
-        <w:t>One</w:t>
+        <w:t>Password</w:t>
       </w:r>
       <w:proofErr w:type="spellEnd"/>
       <w:r>
@@ -2611,23 +3559,23 @@
           <w:sz w:val="24"/>
           <w:szCs w:val="24"/>
         </w:rPr>
-        <w:t xml:space="preserve">-Time </w:t>
-      </w:r>
-      <w:proofErr w:type="spellStart"/>
-      <w:r>
-        <w:rPr>
-          <w:sz w:val="24"/>
-          <w:szCs w:val="24"/>
-        </w:rPr>
-        <w:t>Password</w:t>
-      </w:r>
-      <w:proofErr w:type="spellEnd"/>
-      <w:r>
-        <w:rPr>
-          <w:sz w:val="24"/>
-          <w:szCs w:val="24"/>
-        </w:rPr>
-        <w:t xml:space="preserve">) enviado por SMS o app (como Google </w:t>
+        <w:t xml:space="preserve">) enviado por SMS o </w:t>
+      </w:r>
+      <w:proofErr w:type="gramStart"/>
+      <w:r>
+        <w:rPr>
+          <w:sz w:val="24"/>
+          <w:szCs w:val="24"/>
+        </w:rPr>
+        <w:t>app</w:t>
+      </w:r>
+      <w:proofErr w:type="gramEnd"/>
+      <w:r>
+        <w:rPr>
+          <w:sz w:val="24"/>
+          <w:szCs w:val="24"/>
+        </w:rPr>
+        <w:t xml:space="preserve"> (como Google </w:t>
       </w:r>
       <w:proofErr w:type="spellStart"/>
       <w:r>
@@ -2720,7 +3668,6 @@
           <w:sz w:val="24"/>
           <w:szCs w:val="24"/>
         </w:rPr>
-        <w:lastRenderedPageBreak/>
         <w:t>Emisión de token de acceso</w:t>
       </w:r>
       <w:r>
@@ -3207,7 +4154,6 @@
           <w:sz w:val="24"/>
           <w:szCs w:val="24"/>
         </w:rPr>
-        <w:lastRenderedPageBreak/>
         <w:t>GET</w:t>
       </w:r>
       <w:r>
@@ -3595,7 +4541,15 @@
           <w:sz w:val="24"/>
           <w:szCs w:val="24"/>
         </w:rPr>
-        <w:t xml:space="preserve"> Laravel proporciona un entorno completo para el desarrollo de aplicaciones web modernas, destacando por su facilidad de uso, estructura organizada y amplia gama de herramientas integradas. Su enfoque en la seguridad lo convierte en una opción adecuada para proyectos que requieren protección frente a amenazas comunes, especialmente en el desarrollo de </w:t>
+        <w:t xml:space="preserve"> Laravel proporciona un entorno completo para el desarrollo de aplicaciones web modernas, destacando por su facilidad de uso, estructura organizada y amplia gama de herramientas integradas. Su enfoque en la seguridad lo convierte en una opción </w:t>
+      </w:r>
+      <w:r>
+        <w:rPr>
+          <w:sz w:val="24"/>
+          <w:szCs w:val="24"/>
+        </w:rPr>
+        <w:lastRenderedPageBreak/>
+        <w:t xml:space="preserve">adecuada para proyectos que requieren protección frente a amenazas comunes, especialmente en el desarrollo de </w:t>
       </w:r>
       <w:proofErr w:type="spellStart"/>
       <w:r>
@@ -3906,7 +4860,17 @@
           <w:sz w:val="24"/>
           <w:szCs w:val="24"/>
         </w:rPr>
-        <w:t>1. BOLA</w:t>
+        <w:t xml:space="preserve">1. </w:t>
+      </w:r>
+      <w:proofErr w:type="gramStart"/>
+      <w:r>
+        <w:rPr>
+          <w:b/>
+          <w:bCs/>
+          <w:sz w:val="24"/>
+          <w:szCs w:val="24"/>
+        </w:rPr>
+        <w:t>BOLA</w:t>
       </w:r>
       <w:r>
         <w:rPr>
@@ -3920,6 +4884,7 @@
         </w:rPr>
         <w:t>(</w:t>
       </w:r>
+      <w:proofErr w:type="gramEnd"/>
       <w:r>
         <w:rPr>
           <w:sz w:val="24"/>
@@ -3978,7 +4943,6 @@
           <w:sz w:val="24"/>
           <w:szCs w:val="24"/>
         </w:rPr>
-        <w:lastRenderedPageBreak/>
         <w:drawing>
           <wp:inline distT="0" distB="0" distL="0" distR="0" wp14:anchorId="23B722F2" wp14:editId="38906498">
             <wp:extent cx="5400040" cy="952500"/>
@@ -4128,14 +5092,46 @@
           <w:sz w:val="24"/>
           <w:szCs w:val="24"/>
         </w:rPr>
-        <w:t xml:space="preserve"> Además es conveniente utilizar </w:t>
-      </w:r>
-      <w:r>
-        <w:rPr>
-          <w:sz w:val="24"/>
-          <w:szCs w:val="24"/>
-        </w:rPr>
-        <w:t>el mecanismo de autorización para comprobar si el usuario iniciado sesión tiene acceso a Realiza la acción solicitada en el registro en cada función que utiliza un entrada del cliente para acceder a un registro en la base de datos.</w:t>
+        <w:t xml:space="preserve"> </w:t>
+      </w:r>
+      <w:proofErr w:type="gramStart"/>
+      <w:r>
+        <w:rPr>
+          <w:sz w:val="24"/>
+          <w:szCs w:val="24"/>
+        </w:rPr>
+        <w:t>Además</w:t>
+      </w:r>
+      <w:proofErr w:type="gramEnd"/>
+      <w:r>
+        <w:rPr>
+          <w:sz w:val="24"/>
+          <w:szCs w:val="24"/>
+        </w:rPr>
+        <w:t xml:space="preserve"> es conveniente utilizar </w:t>
+      </w:r>
+      <w:r>
+        <w:rPr>
+          <w:sz w:val="24"/>
+          <w:szCs w:val="24"/>
+        </w:rPr>
+        <w:t xml:space="preserve">el mecanismo de autorización para comprobar si el usuario iniciado sesión tiene acceso a Realiza la acción solicitada en el registro en cada función que utiliza </w:t>
+      </w:r>
+      <w:proofErr w:type="gramStart"/>
+      <w:r>
+        <w:rPr>
+          <w:sz w:val="24"/>
+          <w:szCs w:val="24"/>
+        </w:rPr>
+        <w:t>un entrada</w:t>
+      </w:r>
+      <w:proofErr w:type="gramEnd"/>
+      <w:r>
+        <w:rPr>
+          <w:sz w:val="24"/>
+          <w:szCs w:val="24"/>
+        </w:rPr>
+        <w:t xml:space="preserve"> del cliente para acceder a un registro en la base de datos.</w:t>
       </w:r>
     </w:p>
     <w:p>
@@ -4262,6 +5258,7 @@
           <w:sz w:val="24"/>
           <w:szCs w:val="24"/>
         </w:rPr>
+        <w:lastRenderedPageBreak/>
         <w:t xml:space="preserve">Los atacantes podrán realizarlo si </w:t>
       </w:r>
       <w:r>
@@ -4597,7 +5594,6 @@
           <w:sz w:val="24"/>
           <w:szCs w:val="24"/>
         </w:rPr>
-        <w:lastRenderedPageBreak/>
         <w:drawing>
           <wp:inline distT="0" distB="0" distL="0" distR="0" wp14:anchorId="65EA7A7C" wp14:editId="47E20D78">
             <wp:extent cx="5400040" cy="1120775"/>
@@ -4995,7 +5991,15 @@
           <w:sz w:val="24"/>
           <w:szCs w:val="24"/>
         </w:rPr>
-        <w:t xml:space="preserve">Definir y hacer cumplir un tamaño máximo de datos en todos los parámetros entrantes y cargas útiles, como la longitud máxima para cadenas, número máximo de elementos en </w:t>
+        <w:t xml:space="preserve">Definir y hacer cumplir un tamaño máximo de datos en todos los parámetros entrantes y cargas </w:t>
+      </w:r>
+      <w:r>
+        <w:rPr>
+          <w:sz w:val="24"/>
+          <w:szCs w:val="24"/>
+        </w:rPr>
+        <w:lastRenderedPageBreak/>
+        <w:t xml:space="preserve">útiles, como la longitud máxima para cadenas, número máximo de elementos en </w:t>
       </w:r>
       <w:proofErr w:type="spellStart"/>
       <w:r>
@@ -5159,15 +6163,7 @@
           <w:sz w:val="24"/>
           <w:szCs w:val="24"/>
         </w:rPr>
-        <w:t xml:space="preserve">Estos defectos permiten a los atacantes acceder a funcionalidades no autorizadas. Las </w:t>
-      </w:r>
-      <w:r>
-        <w:rPr>
-          <w:sz w:val="24"/>
-          <w:szCs w:val="24"/>
-        </w:rPr>
-        <w:lastRenderedPageBreak/>
-        <w:t>funciones administrativas son objetivos clave para este tipo de ataque y pueden provocar la divulgación de datos, la pérdida o corrupción de datos. En última instancia, puede provocar interrupciones en el servicio.</w:t>
+        <w:t>Estos defectos permiten a los atacantes acceder a funcionalidades no autorizadas. Las funciones administrativas son objetivos clave para este tipo de ataque y pueden provocar la divulgación de datos, la pérdida o corrupción de datos. En última instancia, puede provocar interrupciones en el servicio.</w:t>
       </w:r>
       <w:r>
         <w:rPr>
@@ -5598,6 +6594,7 @@
           <w:sz w:val="24"/>
           <w:szCs w:val="24"/>
         </w:rPr>
+        <w:lastRenderedPageBreak/>
         <w:drawing>
           <wp:inline distT="0" distB="0" distL="0" distR="0" wp14:anchorId="59F82ADE" wp14:editId="744117B2">
             <wp:extent cx="5400040" cy="925195"/>
@@ -5730,7 +6727,6 @@
           <w:sz w:val="24"/>
           <w:szCs w:val="24"/>
         </w:rPr>
-        <w:lastRenderedPageBreak/>
         <w:t>-</w:t>
       </w:r>
       <w:r>
@@ -6237,6 +7233,7 @@
           <w:sz w:val="24"/>
           <w:szCs w:val="24"/>
         </w:rPr>
+        <w:lastRenderedPageBreak/>
         <w:t xml:space="preserve">Con </w:t>
       </w:r>
       <w:proofErr w:type="spellStart"/>
@@ -6267,6 +7264,7 @@
         <w:t xml:space="preserve"> Simplemente escribes: </w:t>
       </w:r>
       <w:proofErr w:type="spellStart"/>
+      <w:proofErr w:type="gramStart"/>
       <w:r>
         <w:rPr>
           <w:sz w:val="24"/>
@@ -6296,7 +7294,15 @@
           <w:sz w:val="24"/>
           <w:szCs w:val="24"/>
         </w:rPr>
-        <w:t>(1);</w:t>
+        <w:t>(</w:t>
+      </w:r>
+      <w:proofErr w:type="gramEnd"/>
+      <w:r>
+        <w:rPr>
+          <w:sz w:val="24"/>
+          <w:szCs w:val="24"/>
+        </w:rPr>
+        <w:t>1);</w:t>
       </w:r>
     </w:p>
     <w:p>
@@ -6329,7 +7335,23 @@
           <w:sz w:val="24"/>
           <w:szCs w:val="24"/>
         </w:rPr>
-        <w:t>, por eso tienes una carpeta llamada app/</w:t>
+        <w:t xml:space="preserve">, por eso tienes una carpeta llamada </w:t>
+      </w:r>
+      <w:proofErr w:type="gramStart"/>
+      <w:r>
+        <w:rPr>
+          <w:sz w:val="24"/>
+          <w:szCs w:val="24"/>
+        </w:rPr>
+        <w:t>app</w:t>
+      </w:r>
+      <w:proofErr w:type="gramEnd"/>
+      <w:r>
+        <w:rPr>
+          <w:sz w:val="24"/>
+          <w:szCs w:val="24"/>
+        </w:rPr>
+        <w:t>/</w:t>
       </w:r>
       <w:proofErr w:type="spellStart"/>
       <w:r>
@@ -6558,7 +7580,6 @@
           <w:sz w:val="24"/>
           <w:szCs w:val="24"/>
         </w:rPr>
-        <w:lastRenderedPageBreak/>
         <w:t>-</w:t>
       </w:r>
       <w:r>
@@ -6607,7 +7628,15 @@
           <w:sz w:val="24"/>
           <w:szCs w:val="24"/>
         </w:rPr>
-        <w:t>, no tienes que cambiar ni una línea de código de tu API. Solo cambias una línea en el archivo .</w:t>
+        <w:t xml:space="preserve">, no tienes que cambiar ni una línea de código de tu API. Solo cambias una línea en el </w:t>
+      </w:r>
+      <w:proofErr w:type="gramStart"/>
+      <w:r>
+        <w:rPr>
+          <w:sz w:val="24"/>
+          <w:szCs w:val="24"/>
+        </w:rPr>
+        <w:t>archivo .</w:t>
       </w:r>
       <w:proofErr w:type="spellStart"/>
       <w:r>
@@ -6618,6 +7647,7 @@
         <w:t>env</w:t>
       </w:r>
       <w:proofErr w:type="spellEnd"/>
+      <w:proofErr w:type="gramEnd"/>
       <w:r>
         <w:rPr>
           <w:sz w:val="24"/>
@@ -6941,7 +7971,6 @@
           <w:sz w:val="24"/>
           <w:szCs w:val="24"/>
         </w:rPr>
-        <w:lastRenderedPageBreak/>
         <w:drawing>
           <wp:inline distT="0" distB="0" distL="0" distR="0" wp14:anchorId="2AC8C65C" wp14:editId="7E25FFC6">
             <wp:extent cx="5400040" cy="2917825"/>
@@ -7282,7 +8311,6 @@
           <w:sz w:val="24"/>
           <w:szCs w:val="24"/>
         </w:rPr>
-        <w:lastRenderedPageBreak/>
         <w:t>Para garantizar un entorno de desarrollo profesional, aislado y reproducible, se han utilizado las siguientes tecnologías:</w:t>
       </w:r>
     </w:p>
@@ -7417,23 +8445,7 @@
           <w:sz w:val="24"/>
           <w:szCs w:val="24"/>
         </w:rPr>
-        <w:t xml:space="preserve"> Se ha optado por la "</w:t>
-      </w:r>
-      <w:proofErr w:type="spellStart"/>
-      <w:r>
-        <w:rPr>
-          <w:sz w:val="24"/>
-          <w:szCs w:val="24"/>
-        </w:rPr>
-        <w:t>contenedorización</w:t>
-      </w:r>
-      <w:proofErr w:type="spellEnd"/>
-      <w:r>
-        <w:rPr>
-          <w:sz w:val="24"/>
-          <w:szCs w:val="24"/>
-        </w:rPr>
-        <w:t xml:space="preserve">" del proyecto. Mediante Laravel </w:t>
+        <w:t xml:space="preserve"> Se ha optado por la "contenedorización" del proyecto. Mediante Laravel </w:t>
       </w:r>
       <w:proofErr w:type="spellStart"/>
       <w:r>
@@ -7598,6 +8610,7 @@
           <w:sz w:val="24"/>
           <w:szCs w:val="24"/>
         </w:rPr>
+        <w:lastRenderedPageBreak/>
         <w:drawing>
           <wp:inline distT="0" distB="0" distL="0" distR="0" wp14:anchorId="7BAB5E6C" wp14:editId="0DBE39FD">
             <wp:extent cx="5400040" cy="3039110"/>
@@ -7737,7 +8750,6 @@
           <w:sz w:val="24"/>
           <w:szCs w:val="24"/>
         </w:rPr>
-        <w:lastRenderedPageBreak/>
         <w:t>Control de versiones:</w:t>
       </w:r>
       <w:r>
@@ -7916,6 +8928,7 @@
           <w:sz w:val="24"/>
           <w:szCs w:val="24"/>
         </w:rPr>
+        <w:lastRenderedPageBreak/>
         <w:drawing>
           <wp:inline distT="0" distB="0" distL="0" distR="0" wp14:anchorId="0E9029F4" wp14:editId="6FCB72F0">
             <wp:extent cx="5400040" cy="3165475"/>
@@ -8000,7 +9013,6 @@
           <w:sz w:val="28"/>
           <w:szCs w:val="28"/>
         </w:rPr>
-        <w:lastRenderedPageBreak/>
         <w:drawing>
           <wp:inline distT="0" distB="0" distL="0" distR="0" wp14:anchorId="5406D354" wp14:editId="35BA4E33">
             <wp:extent cx="5400040" cy="2846705"/>
@@ -8056,6 +9068,7 @@
           <w:sz w:val="28"/>
           <w:szCs w:val="28"/>
         </w:rPr>
+        <w:lastRenderedPageBreak/>
         <w:drawing>
           <wp:inline distT="0" distB="0" distL="0" distR="0" wp14:anchorId="6E1877EB" wp14:editId="70983B1C">
             <wp:extent cx="5400040" cy="2700020"/>
@@ -8249,7 +9262,6 @@
           <w:sz w:val="24"/>
           <w:szCs w:val="24"/>
         </w:rPr>
-        <w:lastRenderedPageBreak/>
         <mc:AlternateContent>
           <mc:Choice Requires="wps">
             <w:drawing>
@@ -8416,6 +9428,7 @@
           <w:sz w:val="28"/>
           <w:szCs w:val="28"/>
         </w:rPr>
+        <w:lastRenderedPageBreak/>
         <w:t>Definición de rutas</w:t>
       </w:r>
     </w:p>
@@ -8504,7 +9517,6 @@
           <w:sz w:val="24"/>
           <w:szCs w:val="24"/>
         </w:rPr>
-        <w:lastRenderedPageBreak/>
         <w:drawing>
           <wp:inline distT="0" distB="0" distL="0" distR="0" wp14:anchorId="081698C8" wp14:editId="016144D4">
             <wp:extent cx="2120900" cy="2733304"/>
@@ -8624,6 +9636,7 @@
           <w:sz w:val="36"/>
           <w:szCs w:val="36"/>
         </w:rPr>
+        <w:lastRenderedPageBreak/>
         <w:t>Capítulo</w:t>
       </w:r>
       <w:r>
@@ -8674,7 +9687,6 @@
           <w:sz w:val="36"/>
           <w:szCs w:val="36"/>
         </w:rPr>
-        <w:lastRenderedPageBreak/>
         <w:drawing>
           <wp:inline distT="0" distB="0" distL="0" distR="0" wp14:anchorId="278F5F92" wp14:editId="19C8C29A">
             <wp:extent cx="5400040" cy="3175000"/>

</xml_diff>